<commit_message>
docs: fill Brief section 3.3 (metrics contract) and 4.1 (ML criteria)
</commit_message>
<xml_diff>
--- a/Project_Brief_Template_v2.docx
+++ b/Project_Brief_Template_v2.docx
@@ -2457,7 +2457,47 @@
           <w:szCs w:val="20"/>
           <w:lang w:val="en-US"/>
         </w:rPr>
-        <w:t xml:space="preserve">: regression — T_ret_sec(t+h), h </w:t>
+        <w:t xml:space="preserve">: regression — </w:t>
+      </w:r>
+      <w:proofErr w:type="spellStart"/>
+      <w:r>
+        <w:rPr>
+          <w:color w:val="E65100"/>
+          <w:sz w:val="20"/>
+          <w:szCs w:val="20"/>
+          <w:lang w:val="en-US"/>
+        </w:rPr>
+        <w:t>T_ret_sec</w:t>
+      </w:r>
+      <w:proofErr w:type="spellEnd"/>
+      <w:r>
+        <w:rPr>
+          <w:color w:val="E65100"/>
+          <w:sz w:val="20"/>
+          <w:szCs w:val="20"/>
+          <w:lang w:val="en-US"/>
+        </w:rPr>
+        <w:t>(</w:t>
+      </w:r>
+      <w:proofErr w:type="spellStart"/>
+      <w:r>
+        <w:rPr>
+          <w:color w:val="E65100"/>
+          <w:sz w:val="20"/>
+          <w:szCs w:val="20"/>
+          <w:lang w:val="en-US"/>
+        </w:rPr>
+        <w:t>t+h</w:t>
+      </w:r>
+      <w:proofErr w:type="spellEnd"/>
+      <w:r>
+        <w:rPr>
+          <w:color w:val="E65100"/>
+          <w:sz w:val="20"/>
+          <w:szCs w:val="20"/>
+          <w:lang w:val="en-US"/>
+        </w:rPr>
+        <w:t xml:space="preserve">), h </w:t>
       </w:r>
       <w:r>
         <w:rPr>
@@ -2524,7 +2564,107 @@
           <w:szCs w:val="20"/>
           <w:lang w:val="en-US"/>
         </w:rPr>
-        <w:t xml:space="preserve">: SCADA XAI4HEAT (t_amb, t_ref, t_sup, t_ret, delta_e) × 5 </w:t>
+        <w:t>: SCADA XAI4HEAT (</w:t>
+      </w:r>
+      <w:proofErr w:type="spellStart"/>
+      <w:r>
+        <w:rPr>
+          <w:color w:val="E65100"/>
+          <w:sz w:val="20"/>
+          <w:szCs w:val="20"/>
+          <w:lang w:val="en-US"/>
+        </w:rPr>
+        <w:t>t_amb</w:t>
+      </w:r>
+      <w:proofErr w:type="spellEnd"/>
+      <w:r>
+        <w:rPr>
+          <w:color w:val="E65100"/>
+          <w:sz w:val="20"/>
+          <w:szCs w:val="20"/>
+          <w:lang w:val="en-US"/>
+        </w:rPr>
+        <w:t xml:space="preserve">, </w:t>
+      </w:r>
+      <w:proofErr w:type="spellStart"/>
+      <w:r>
+        <w:rPr>
+          <w:color w:val="E65100"/>
+          <w:sz w:val="20"/>
+          <w:szCs w:val="20"/>
+          <w:lang w:val="en-US"/>
+        </w:rPr>
+        <w:t>t_ref</w:t>
+      </w:r>
+      <w:proofErr w:type="spellEnd"/>
+      <w:r>
+        <w:rPr>
+          <w:color w:val="E65100"/>
+          <w:sz w:val="20"/>
+          <w:szCs w:val="20"/>
+          <w:lang w:val="en-US"/>
+        </w:rPr>
+        <w:t xml:space="preserve">, </w:t>
+      </w:r>
+      <w:proofErr w:type="spellStart"/>
+      <w:r>
+        <w:rPr>
+          <w:color w:val="E65100"/>
+          <w:sz w:val="20"/>
+          <w:szCs w:val="20"/>
+          <w:lang w:val="en-US"/>
+        </w:rPr>
+        <w:t>t_sup</w:t>
+      </w:r>
+      <w:proofErr w:type="spellEnd"/>
+      <w:r>
+        <w:rPr>
+          <w:color w:val="E65100"/>
+          <w:sz w:val="20"/>
+          <w:szCs w:val="20"/>
+          <w:lang w:val="en-US"/>
+        </w:rPr>
+        <w:t xml:space="preserve">, </w:t>
+      </w:r>
+      <w:proofErr w:type="spellStart"/>
+      <w:r>
+        <w:rPr>
+          <w:color w:val="E65100"/>
+          <w:sz w:val="20"/>
+          <w:szCs w:val="20"/>
+          <w:lang w:val="en-US"/>
+        </w:rPr>
+        <w:t>t_ret</w:t>
+      </w:r>
+      <w:proofErr w:type="spellEnd"/>
+      <w:r>
+        <w:rPr>
+          <w:color w:val="E65100"/>
+          <w:sz w:val="20"/>
+          <w:szCs w:val="20"/>
+          <w:lang w:val="en-US"/>
+        </w:rPr>
+        <w:t xml:space="preserve">, </w:t>
+      </w:r>
+      <w:proofErr w:type="spellStart"/>
+      <w:r>
+        <w:rPr>
+          <w:color w:val="E65100"/>
+          <w:sz w:val="20"/>
+          <w:szCs w:val="20"/>
+          <w:lang w:val="en-US"/>
+        </w:rPr>
+        <w:t>delta_e</w:t>
+      </w:r>
+      <w:proofErr w:type="spellEnd"/>
+      <w:r>
+        <w:rPr>
+          <w:color w:val="E65100"/>
+          <w:sz w:val="20"/>
+          <w:szCs w:val="20"/>
+          <w:lang w:val="en-US"/>
+        </w:rPr>
+        <w:t xml:space="preserve">) × 5 </w:t>
       </w:r>
       <w:r>
         <w:rPr>
@@ -3553,71 +3693,8 @@
             </w:tcMar>
           </w:tcPr>
           <w:p>
-            <w:proofErr w:type="spellStart"/>
-            <w:r>
-              <w:rPr>
-                <w:i/>
-                <w:iCs/>
-                <w:color w:val="9E9E9E"/>
-                <w:sz w:val="20"/>
-                <w:szCs w:val="20"/>
-              </w:rPr>
-              <w:t>energy_per_HDD</w:t>
-            </w:r>
-            <w:proofErr w:type="spellEnd"/>
-            <w:r>
-              <w:rPr>
-                <w:i/>
-                <w:iCs/>
-                <w:color w:val="9E9E9E"/>
-                <w:sz w:val="20"/>
-                <w:szCs w:val="20"/>
-              </w:rPr>
-              <w:t xml:space="preserve"> (</w:t>
-            </w:r>
-            <w:proofErr w:type="spellStart"/>
-            <w:r>
-              <w:rPr>
-                <w:i/>
-                <w:iCs/>
-                <w:color w:val="9E9E9E"/>
-                <w:sz w:val="20"/>
-                <w:szCs w:val="20"/>
-              </w:rPr>
-              <w:t>кВтч</w:t>
-            </w:r>
-            <w:proofErr w:type="spellEnd"/>
-            <w:r>
-              <w:rPr>
-                <w:i/>
-                <w:iCs/>
-                <w:color w:val="9E9E9E"/>
-                <w:sz w:val="20"/>
-                <w:szCs w:val="20"/>
-              </w:rPr>
-              <w:t xml:space="preserve"> / м² / </w:t>
-            </w:r>
-            <w:proofErr w:type="spellStart"/>
-            <w:r>
-              <w:rPr>
-                <w:i/>
-                <w:iCs/>
-                <w:color w:val="9E9E9E"/>
-                <w:sz w:val="20"/>
-                <w:szCs w:val="20"/>
-              </w:rPr>
-              <w:t>градусо</w:t>
-            </w:r>
-            <w:proofErr w:type="spellEnd"/>
-            <w:r>
-              <w:rPr>
-                <w:i/>
-                <w:iCs/>
-                <w:color w:val="9E9E9E"/>
-                <w:sz w:val="20"/>
-                <w:szCs w:val="20"/>
-              </w:rPr>
-              <w:t>-сутки)</w:t>
+            <w:r>
+              <w:t>MAE</w:t>
             </w:r>
           </w:p>
         </w:tc>
@@ -3675,137 +3752,40 @@
             </w:tcMar>
           </w:tcPr>
           <w:p>
-            <w:pPr>
-              <w:rPr>
-                <w:lang w:val="en-US"/>
-              </w:rPr>
-            </w:pPr>
-            <w:r>
-              <w:rPr>
-                <w:i/>
-                <w:iCs/>
-                <w:color w:val="9E9E9E"/>
-                <w:sz w:val="20"/>
-                <w:szCs w:val="20"/>
-              </w:rPr>
-              <w:t>Σ</w:t>
-            </w:r>
-            <w:r>
-              <w:rPr>
-                <w:i/>
-                <w:iCs/>
-                <w:color w:val="9E9E9E"/>
-                <w:sz w:val="20"/>
-                <w:szCs w:val="20"/>
-                <w:lang w:val="en-US"/>
-              </w:rPr>
+            <w:r>
+              <w:t xml:space="preserve">MAE = </w:t>
+            </w:r>
+            <w:proofErr w:type="spellStart"/>
+            <w:r>
+              <w:t>Σ|ŷ</w:t>
+            </w:r>
+            <w:proofErr w:type="spellEnd"/>
+            <w:r>
               <w:t>(</w:t>
             </w:r>
             <w:proofErr w:type="spellStart"/>
             <w:r>
-              <w:rPr>
-                <w:i/>
-                <w:iCs/>
-                <w:color w:val="9E9E9E"/>
-                <w:sz w:val="20"/>
-                <w:szCs w:val="20"/>
-                <w:lang w:val="en-US"/>
-              </w:rPr>
-              <w:t>energy_kWh</w:t>
+              <w:t>t+h</w:t>
             </w:r>
             <w:proofErr w:type="spellEnd"/>
             <w:r>
-              <w:rPr>
-                <w:i/>
-                <w:iCs/>
-                <w:color w:val="9E9E9E"/>
-                <w:sz w:val="20"/>
-                <w:szCs w:val="20"/>
-                <w:lang w:val="en-US"/>
-              </w:rPr>
-              <w:t xml:space="preserve">) / </w:t>
+              <w:t>) − y(</w:t>
             </w:r>
             <w:proofErr w:type="spellStart"/>
             <w:r>
-              <w:rPr>
-                <w:i/>
-                <w:iCs/>
-                <w:color w:val="9E9E9E"/>
-                <w:sz w:val="20"/>
-                <w:szCs w:val="20"/>
-                <w:lang w:val="en-US"/>
-              </w:rPr>
-              <w:t>heating_area</w:t>
+              <w:t>t+</w:t>
+            </w:r>
+            <w:proofErr w:type="gramStart"/>
+            <w:r>
+              <w:t>h</w:t>
             </w:r>
             <w:proofErr w:type="spellEnd"/>
             <w:r>
-              <w:rPr>
-                <w:i/>
-                <w:iCs/>
-                <w:color w:val="9E9E9E"/>
-                <w:sz w:val="20"/>
-                <w:szCs w:val="20"/>
-                <w:lang w:val="en-US"/>
-              </w:rPr>
-              <w:t xml:space="preserve"> / </w:t>
-            </w:r>
-            <w:proofErr w:type="gramStart"/>
-            <w:r>
-              <w:rPr>
-                <w:i/>
-                <w:iCs/>
-                <w:color w:val="9E9E9E"/>
-                <w:sz w:val="20"/>
-                <w:szCs w:val="20"/>
-              </w:rPr>
-              <w:t>Σ</w:t>
-            </w:r>
-            <w:r>
-              <w:rPr>
-                <w:i/>
-                <w:iCs/>
-                <w:color w:val="9E9E9E"/>
-                <w:sz w:val="20"/>
-                <w:szCs w:val="20"/>
-                <w:lang w:val="en-US"/>
-              </w:rPr>
-              <w:t>(</w:t>
+              <w:t>)|</w:t>
             </w:r>
             <w:proofErr w:type="gramEnd"/>
             <w:r>
-              <w:rPr>
-                <w:i/>
-                <w:iCs/>
-                <w:color w:val="9E9E9E"/>
-                <w:sz w:val="20"/>
-                <w:szCs w:val="20"/>
-                <w:lang w:val="en-US"/>
-              </w:rPr>
-              <w:t xml:space="preserve">max(0, 18 - </w:t>
-            </w:r>
-            <w:proofErr w:type="spellStart"/>
-            <w:r>
-              <w:rPr>
-                <w:i/>
-                <w:iCs/>
-                <w:color w:val="9E9E9E"/>
-                <w:sz w:val="20"/>
-                <w:szCs w:val="20"/>
-                <w:lang w:val="en-US"/>
-              </w:rPr>
-              <w:t>T_outdoor</w:t>
-            </w:r>
-            <w:proofErr w:type="spellEnd"/>
-            <w:r>
-              <w:rPr>
-                <w:i/>
-                <w:iCs/>
-                <w:color w:val="9E9E9E"/>
-                <w:sz w:val="20"/>
-                <w:szCs w:val="20"/>
-                <w:lang w:val="en-US"/>
-              </w:rPr>
-              <w:t>) / 24)</w:t>
+              <w:t xml:space="preserve"> / N</w:t>
             </w:r>
           </w:p>
         </w:tc>
@@ -3863,28 +3843,14 @@
             </w:tcMar>
           </w:tcPr>
           <w:p>
-            <w:r>
-              <w:rPr>
-                <w:i/>
-                <w:iCs/>
-                <w:color w:val="9E9E9E"/>
-                <w:sz w:val="20"/>
-                <w:szCs w:val="20"/>
-              </w:rPr>
-              <w:t xml:space="preserve">снижение на ≥ 5% относительно </w:t>
-            </w:r>
-            <w:proofErr w:type="spellStart"/>
-            <w:r>
-              <w:rPr>
-                <w:i/>
-                <w:iCs/>
-                <w:color w:val="9E9E9E"/>
-                <w:sz w:val="20"/>
-                <w:szCs w:val="20"/>
-              </w:rPr>
-              <w:t>baseline</w:t>
-            </w:r>
-            <w:proofErr w:type="spellEnd"/>
+            <w:proofErr w:type="gramStart"/>
+            <w:r>
+              <w:t>&lt; 2</w:t>
+            </w:r>
+            <w:proofErr w:type="gramEnd"/>
+            <w:r>
+              <w:t>°C</w:t>
+            </w:r>
           </w:p>
         </w:tc>
       </w:tr>
@@ -3992,49 +3958,101 @@
             </w:tcMar>
           </w:tcPr>
           <w:p>
+            <w:pPr>
+              <w:rPr>
+                <w:lang w:val="en-US"/>
+              </w:rPr>
+            </w:pPr>
             <w:proofErr w:type="spellStart"/>
             <w:r>
               <w:rPr>
-                <w:i/>
-                <w:iCs/>
-                <w:color w:val="9E9E9E"/>
-                <w:sz w:val="20"/>
-                <w:szCs w:val="20"/>
-              </w:rPr>
-              <w:t>T_</w:t>
-            </w:r>
-            <w:proofErr w:type="gramStart"/>
-            <w:r>
-              <w:rPr>
-                <w:i/>
-                <w:iCs/>
-                <w:color w:val="9E9E9E"/>
-                <w:sz w:val="20"/>
-                <w:szCs w:val="20"/>
-              </w:rPr>
-              <w:t>return</w:t>
+                <w:lang w:val="en-US"/>
+              </w:rPr>
+              <w:t>T_ret_sec</w:t>
             </w:r>
             <w:proofErr w:type="spellEnd"/>
             <w:r>
               <w:rPr>
-                <w:i/>
-                <w:iCs/>
-                <w:color w:val="9E9E9E"/>
-                <w:sz w:val="20"/>
-                <w:szCs w:val="20"/>
-              </w:rPr>
-              <w:t xml:space="preserve"> &gt;</w:t>
-            </w:r>
-            <w:proofErr w:type="gramEnd"/>
-            <w:r>
-              <w:rPr>
-                <w:i/>
-                <w:iCs/>
-                <w:color w:val="9E9E9E"/>
-                <w:sz w:val="20"/>
-                <w:szCs w:val="20"/>
-              </w:rPr>
-              <w:t xml:space="preserve"> 42°С (СанПиН / температурный график)</w:t>
+                <w:lang w:val="en-US"/>
+              </w:rPr>
+              <w:t>(</w:t>
+            </w:r>
+            <w:proofErr w:type="spellStart"/>
+            <w:r>
+              <w:rPr>
+                <w:lang w:val="en-US"/>
+              </w:rPr>
+              <w:t>t+h</w:t>
+            </w:r>
+            <w:proofErr w:type="spellEnd"/>
+            <w:r>
+              <w:rPr>
+                <w:lang w:val="en-US"/>
+              </w:rPr>
+              <w:t xml:space="preserve">) ≥ </w:t>
+            </w:r>
+            <w:proofErr w:type="spellStart"/>
+            <w:r>
+              <w:rPr>
+                <w:lang w:val="en-US"/>
+              </w:rPr>
+              <w:t>T_min</w:t>
+            </w:r>
+            <w:proofErr w:type="spellEnd"/>
+            <w:r>
+              <w:rPr>
+                <w:lang w:val="en-US"/>
+              </w:rPr>
+              <w:t>(</w:t>
+            </w:r>
+            <w:proofErr w:type="spellStart"/>
+            <w:r>
+              <w:rPr>
+                <w:lang w:val="en-US"/>
+              </w:rPr>
+              <w:t>T_amb</w:t>
+            </w:r>
+            <w:proofErr w:type="spellEnd"/>
+            <w:r>
+              <w:rPr>
+                <w:lang w:val="en-US"/>
+              </w:rPr>
+              <w:t>(</w:t>
+            </w:r>
+            <w:proofErr w:type="spellStart"/>
+            <w:r>
+              <w:rPr>
+                <w:lang w:val="en-US"/>
+              </w:rPr>
+              <w:t>t+h</w:t>
+            </w:r>
+            <w:proofErr w:type="spellEnd"/>
+            <w:r>
+              <w:rPr>
+                <w:lang w:val="en-US"/>
+              </w:rPr>
+              <w:t>))</w:t>
+            </w:r>
+            <w:r>
+              <w:rPr>
+                <w:lang w:val="en-US"/>
+              </w:rPr>
+              <w:t xml:space="preserve"> </w:t>
+            </w:r>
+            <w:r>
+              <w:t>и</w:t>
+            </w:r>
+            <w:r>
+              <w:rPr>
+                <w:lang w:val="en-US"/>
+              </w:rPr>
+              <w:t xml:space="preserve"> </w:t>
+            </w:r>
+            <w:r>
+              <w:rPr>
+                <w:lang w:val="en-US"/>
+              </w:rPr>
+              <w:t>Conformal PI coverage ≥ 90%</w:t>
             </w:r>
           </w:p>
         </w:tc>
@@ -4137,35 +4155,132 @@
     </w:p>
     <w:p>
       <w:pPr>
-        <w:shd w:val="clear" w:color="auto" w:fill="FFF3E0"/>
-        <w:spacing w:after="100"/>
+        <w:pStyle w:val="2"/>
       </w:pPr>
-      <w:r>
-        <w:rPr>
-          <w:color w:val="E65100"/>
-          <w:sz w:val="20"/>
-          <w:szCs w:val="20"/>
-        </w:rPr>
-        <w:t xml:space="preserve">[ΔT, число аварийных корректировок, расход подпитки, </w:t>
-      </w:r>
       <w:proofErr w:type="spellStart"/>
       <w:r>
-        <w:rPr>
-          <w:color w:val="E65100"/>
-          <w:sz w:val="20"/>
-          <w:szCs w:val="20"/>
-        </w:rPr>
-        <w:t>T_outdoor_forecast_error</w:t>
+        <w:t>Bias</w:t>
       </w:r>
       <w:proofErr w:type="spellEnd"/>
       <w:r>
-        <w:rPr>
-          <w:color w:val="E65100"/>
-          <w:sz w:val="20"/>
-          <w:szCs w:val="20"/>
-        </w:rPr>
-        <w:t>]</w:t>
-      </w:r>
+        <w:t xml:space="preserve"> (</w:t>
+      </w:r>
+      <w:proofErr w:type="spellStart"/>
+      <w:r>
+        <w:t>mean</w:t>
+      </w:r>
+      <w:proofErr w:type="spellEnd"/>
+      <w:r>
+        <w:t xml:space="preserve"> </w:t>
+      </w:r>
+      <w:proofErr w:type="spellStart"/>
+      <w:r>
+        <w:t>error</w:t>
+      </w:r>
+      <w:proofErr w:type="spellEnd"/>
+      <w:r>
+        <w:t xml:space="preserve">) </w:t>
+      </w:r>
+      <w:r>
+        <w:rPr>
+          <w:rFonts w:ascii="Cambria Math" w:hAnsi="Cambria Math" w:cs="Cambria Math"/>
+        </w:rPr>
+        <w:t>∈</w:t>
+      </w:r>
+      <w:r>
+        <w:t xml:space="preserve"> [−0.5, +0.</w:t>
+      </w:r>
+      <w:proofErr w:type="gramStart"/>
+      <w:r>
+        <w:t>5]°</w:t>
+      </w:r>
+      <w:proofErr w:type="gramEnd"/>
+      <w:r>
+        <w:t xml:space="preserve">C — нет систематического смещения </w:t>
+      </w:r>
+    </w:p>
+    <w:p>
+      <w:pPr>
+        <w:pStyle w:val="2"/>
+      </w:pPr>
+      <w:r>
+        <w:t xml:space="preserve">MAE по горизонтам: h=6 </w:t>
+      </w:r>
+      <w:proofErr w:type="gramStart"/>
+      <w:r>
+        <w:t>&lt; h</w:t>
+      </w:r>
+      <w:proofErr w:type="gramEnd"/>
+      <w:r>
+        <w:t xml:space="preserve">=12 &lt; h=24 (деградация контролируемая) </w:t>
+      </w:r>
+    </w:p>
+    <w:p>
+      <w:pPr>
+        <w:pStyle w:val="2"/>
+      </w:pPr>
+      <w:r>
+        <w:lastRenderedPageBreak/>
+        <w:t>MAE при пуске/останове (</w:t>
+      </w:r>
+      <w:proofErr w:type="spellStart"/>
+      <w:r>
+        <w:t>transition</w:t>
+      </w:r>
+      <w:proofErr w:type="spellEnd"/>
+      <w:r>
+        <w:t xml:space="preserve">) — отдельно (ожидаем выше) </w:t>
+      </w:r>
+    </w:p>
+    <w:p>
+      <w:pPr>
+        <w:pStyle w:val="2"/>
+      </w:pPr>
+      <w:r>
+        <w:t>R</w:t>
+      </w:r>
+      <w:proofErr w:type="gramStart"/>
+      <w:r>
+        <w:t>² &gt;</w:t>
+      </w:r>
+      <w:proofErr w:type="gramEnd"/>
+      <w:r>
+        <w:t xml:space="preserve"> 0.85 ΔT (</w:t>
+      </w:r>
+      <w:proofErr w:type="spellStart"/>
+      <w:r>
+        <w:t>перетоп</w:t>
+      </w:r>
+      <w:proofErr w:type="spellEnd"/>
+      <w:r>
+        <w:t xml:space="preserve"> в °</w:t>
+      </w:r>
+      <w:proofErr w:type="spellStart"/>
+      <w:r>
+        <w:t>C·ч</w:t>
+      </w:r>
+      <w:proofErr w:type="spellEnd"/>
+      <w:r>
+        <w:t xml:space="preserve">) снижается </w:t>
+      </w:r>
+      <w:proofErr w:type="spellStart"/>
+      <w:r>
+        <w:t>vs</w:t>
+      </w:r>
+      <w:proofErr w:type="spellEnd"/>
+      <w:r>
+        <w:t xml:space="preserve"> </w:t>
+      </w:r>
+      <w:proofErr w:type="spellStart"/>
+      <w:r>
+        <w:t>baseline</w:t>
+      </w:r>
+      <w:proofErr w:type="spellEnd"/>
+    </w:p>
+    <w:p>
+      <w:pPr>
+        <w:pStyle w:val="2"/>
+      </w:pPr>
     </w:p>
     <w:p>
       <w:pPr>
@@ -4227,7 +4342,6 @@
           <w:sz w:val="20"/>
           <w:szCs w:val="20"/>
         </w:rPr>
-        <w:lastRenderedPageBreak/>
         <w:t xml:space="preserve">[ΔQ = </w:t>
       </w:r>
       <w:proofErr w:type="spellStart"/>
@@ -4413,939 +4527,122 @@
         <w:t>tative terms».</w:t>
       </w:r>
     </w:p>
-    <w:tbl>
-      <w:tblPr>
-        <w:tblW w:w="9026" w:type="dxa"/>
-        <w:tblBorders>
-          <w:top w:val="single" w:sz="4" w:space="0" w:color="auto"/>
-          <w:left w:val="single" w:sz="4" w:space="0" w:color="auto"/>
-          <w:bottom w:val="single" w:sz="4" w:space="0" w:color="auto"/>
-          <w:right w:val="single" w:sz="4" w:space="0" w:color="auto"/>
-          <w:insideH w:val="single" w:sz="4" w:space="0" w:color="auto"/>
-          <w:insideV w:val="single" w:sz="4" w:space="0" w:color="auto"/>
-        </w:tblBorders>
-        <w:tblCellMar>
-          <w:left w:w="10" w:type="dxa"/>
-          <w:right w:w="10" w:type="dxa"/>
-        </w:tblCellMar>
-        <w:tblLook w:val="04A0" w:firstRow="1" w:lastRow="0" w:firstColumn="1" w:lastColumn="0" w:noHBand="0" w:noVBand="1"/>
-      </w:tblPr>
-      <w:tblGrid>
-        <w:gridCol w:w="3000"/>
-        <w:gridCol w:w="6026"/>
-      </w:tblGrid>
-      <w:tr>
-        <w:tblPrEx>
-          <w:tblCellMar>
-            <w:top w:w="0" w:type="dxa"/>
-            <w:bottom w:w="0" w:type="dxa"/>
-          </w:tblCellMar>
-        </w:tblPrEx>
-        <w:tc>
-          <w:tcPr>
-            <w:tcW w:w="3000" w:type="dxa"/>
-            <w:tcBorders>
-              <w:top w:val="single" w:sz="1" w:space="0" w:color="CCCCCC"/>
-              <w:left w:val="single" w:sz="1" w:space="0" w:color="CCCCCC"/>
-              <w:bottom w:val="single" w:sz="1" w:space="0" w:color="CCCCCC"/>
-              <w:right w:val="single" w:sz="1" w:space="0" w:color="CCCCCC"/>
-            </w:tcBorders>
-            <w:shd w:val="clear" w:color="auto" w:fill="F5F5F5"/>
-            <w:tcMar>
-              <w:top w:w="60" w:type="dxa"/>
-              <w:left w:w="100" w:type="dxa"/>
-              <w:bottom w:w="60" w:type="dxa"/>
-              <w:right w:w="100" w:type="dxa"/>
-            </w:tcMar>
-          </w:tcPr>
-          <w:p>
-            <w:proofErr w:type="spellStart"/>
-            <w:r>
-              <w:rPr>
-                <w:b/>
-                <w:bCs/>
-                <w:sz w:val="20"/>
-                <w:szCs w:val="20"/>
-              </w:rPr>
-              <w:t>Supervised</w:t>
-            </w:r>
-            <w:proofErr w:type="spellEnd"/>
-            <w:r>
-              <w:rPr>
-                <w:b/>
-                <w:bCs/>
-                <w:sz w:val="20"/>
-                <w:szCs w:val="20"/>
-              </w:rPr>
-              <w:t xml:space="preserve"> / </w:t>
-            </w:r>
-            <w:proofErr w:type="spellStart"/>
-            <w:r>
-              <w:rPr>
-                <w:b/>
-                <w:bCs/>
-                <w:sz w:val="20"/>
-                <w:szCs w:val="20"/>
-              </w:rPr>
-              <w:t>Unsupervised</w:t>
-            </w:r>
-            <w:proofErr w:type="spellEnd"/>
-          </w:p>
-        </w:tc>
-        <w:tc>
-          <w:tcPr>
-            <w:tcW w:w="6026" w:type="dxa"/>
-            <w:tcBorders>
-              <w:top w:val="single" w:sz="1" w:space="0" w:color="CCCCCC"/>
-              <w:left w:val="single" w:sz="1" w:space="0" w:color="CCCCCC"/>
-              <w:bottom w:val="single" w:sz="1" w:space="0" w:color="CCCCCC"/>
-              <w:right w:val="single" w:sz="1" w:space="0" w:color="CCCCCC"/>
-            </w:tcBorders>
-            <w:tcMar>
-              <w:top w:w="60" w:type="dxa"/>
-              <w:left w:w="100" w:type="dxa"/>
-              <w:bottom w:w="60" w:type="dxa"/>
-              <w:right w:w="100" w:type="dxa"/>
-            </w:tcMar>
-          </w:tcPr>
-          <w:p>
-            <w:proofErr w:type="spellStart"/>
-            <w:r>
-              <w:rPr>
-                <w:i/>
-                <w:iCs/>
-                <w:color w:val="9E9E9E"/>
-                <w:sz w:val="20"/>
-                <w:szCs w:val="20"/>
-              </w:rPr>
-              <w:t>Supervised</w:t>
-            </w:r>
-            <w:proofErr w:type="spellEnd"/>
-          </w:p>
-        </w:tc>
-      </w:tr>
-      <w:tr>
-        <w:tblPrEx>
-          <w:tblCellMar>
-            <w:top w:w="0" w:type="dxa"/>
-            <w:bottom w:w="0" w:type="dxa"/>
-          </w:tblCellMar>
-        </w:tblPrEx>
-        <w:tc>
-          <w:tcPr>
-            <w:tcW w:w="3000" w:type="dxa"/>
-            <w:tcBorders>
-              <w:top w:val="single" w:sz="1" w:space="0" w:color="CCCCCC"/>
-              <w:left w:val="single" w:sz="1" w:space="0" w:color="CCCCCC"/>
-              <w:bottom w:val="single" w:sz="1" w:space="0" w:color="CCCCCC"/>
-              <w:right w:val="single" w:sz="1" w:space="0" w:color="CCCCCC"/>
-            </w:tcBorders>
-            <w:shd w:val="clear" w:color="auto" w:fill="F5F5F5"/>
-            <w:tcMar>
-              <w:top w:w="60" w:type="dxa"/>
-              <w:left w:w="100" w:type="dxa"/>
-              <w:bottom w:w="60" w:type="dxa"/>
-              <w:right w:w="100" w:type="dxa"/>
-            </w:tcMar>
-          </w:tcPr>
-          <w:p>
-            <w:proofErr w:type="spellStart"/>
-            <w:r>
-              <w:rPr>
-                <w:b/>
-                <w:bCs/>
-                <w:sz w:val="20"/>
-                <w:szCs w:val="20"/>
-              </w:rPr>
-              <w:t>Regression</w:t>
-            </w:r>
-            <w:proofErr w:type="spellEnd"/>
-            <w:r>
-              <w:rPr>
-                <w:b/>
-                <w:bCs/>
-                <w:sz w:val="20"/>
-                <w:szCs w:val="20"/>
-              </w:rPr>
-              <w:t xml:space="preserve"> / </w:t>
-            </w:r>
-            <w:proofErr w:type="spellStart"/>
-            <w:r>
-              <w:rPr>
-                <w:b/>
-                <w:bCs/>
-                <w:sz w:val="20"/>
-                <w:szCs w:val="20"/>
-              </w:rPr>
-              <w:t>Classification</w:t>
-            </w:r>
-            <w:proofErr w:type="spellEnd"/>
-          </w:p>
-        </w:tc>
-        <w:tc>
-          <w:tcPr>
-            <w:tcW w:w="6026" w:type="dxa"/>
-            <w:tcBorders>
-              <w:top w:val="single" w:sz="1" w:space="0" w:color="CCCCCC"/>
-              <w:left w:val="single" w:sz="1" w:space="0" w:color="CCCCCC"/>
-              <w:bottom w:val="single" w:sz="1" w:space="0" w:color="CCCCCC"/>
-              <w:right w:val="single" w:sz="1" w:space="0" w:color="CCCCCC"/>
-            </w:tcBorders>
-            <w:tcMar>
-              <w:top w:w="60" w:type="dxa"/>
-              <w:left w:w="100" w:type="dxa"/>
-              <w:bottom w:w="60" w:type="dxa"/>
-              <w:right w:w="100" w:type="dxa"/>
-            </w:tcMar>
-          </w:tcPr>
-          <w:p>
-            <w:proofErr w:type="spellStart"/>
-            <w:r>
-              <w:rPr>
-                <w:i/>
-                <w:iCs/>
-                <w:color w:val="9E9E9E"/>
-                <w:sz w:val="20"/>
-                <w:szCs w:val="20"/>
-              </w:rPr>
-              <w:t>Regression</w:t>
-            </w:r>
-            <w:proofErr w:type="spellEnd"/>
-          </w:p>
-        </w:tc>
-      </w:tr>
-      <w:tr>
-        <w:tblPrEx>
-          <w:tblCellMar>
-            <w:top w:w="0" w:type="dxa"/>
-            <w:bottom w:w="0" w:type="dxa"/>
-          </w:tblCellMar>
-        </w:tblPrEx>
-        <w:tc>
-          <w:tcPr>
-            <w:tcW w:w="3000" w:type="dxa"/>
-            <w:tcBorders>
-              <w:top w:val="single" w:sz="1" w:space="0" w:color="CCCCCC"/>
-              <w:left w:val="single" w:sz="1" w:space="0" w:color="CCCCCC"/>
-              <w:bottom w:val="single" w:sz="1" w:space="0" w:color="CCCCCC"/>
-              <w:right w:val="single" w:sz="1" w:space="0" w:color="CCCCCC"/>
-            </w:tcBorders>
-            <w:shd w:val="clear" w:color="auto" w:fill="F5F5F5"/>
-            <w:tcMar>
-              <w:top w:w="60" w:type="dxa"/>
-              <w:left w:w="100" w:type="dxa"/>
-              <w:bottom w:w="60" w:type="dxa"/>
-              <w:right w:w="100" w:type="dxa"/>
-            </w:tcMar>
-          </w:tcPr>
-          <w:p>
-            <w:proofErr w:type="spellStart"/>
-            <w:r>
-              <w:rPr>
-                <w:b/>
-                <w:bCs/>
-                <w:sz w:val="20"/>
-                <w:szCs w:val="20"/>
-              </w:rPr>
-              <w:t>Таргет</w:t>
-            </w:r>
-            <w:proofErr w:type="spellEnd"/>
-          </w:p>
-        </w:tc>
-        <w:tc>
-          <w:tcPr>
-            <w:tcW w:w="6026" w:type="dxa"/>
-            <w:tcBorders>
-              <w:top w:val="single" w:sz="1" w:space="0" w:color="CCCCCC"/>
-              <w:left w:val="single" w:sz="1" w:space="0" w:color="CCCCCC"/>
-              <w:bottom w:val="single" w:sz="1" w:space="0" w:color="CCCCCC"/>
-              <w:right w:val="single" w:sz="1" w:space="0" w:color="CCCCCC"/>
-            </w:tcBorders>
-            <w:tcMar>
-              <w:top w:w="60" w:type="dxa"/>
-              <w:left w:w="100" w:type="dxa"/>
-              <w:bottom w:w="60" w:type="dxa"/>
-              <w:right w:w="100" w:type="dxa"/>
-            </w:tcMar>
-          </w:tcPr>
-          <w:p>
-            <w:pPr>
-              <w:rPr>
-                <w:lang w:val="en-US"/>
-              </w:rPr>
-            </w:pPr>
-            <w:proofErr w:type="spellStart"/>
-            <w:r>
-              <w:rPr>
-                <w:i/>
-                <w:iCs/>
-                <w:color w:val="9E9E9E"/>
-                <w:sz w:val="20"/>
-                <w:szCs w:val="20"/>
-                <w:lang w:val="en-US"/>
-              </w:rPr>
-              <w:t>T_return_</w:t>
-            </w:r>
-            <w:proofErr w:type="gramStart"/>
-            <w:r>
-              <w:rPr>
-                <w:i/>
-                <w:iCs/>
-                <w:color w:val="9E9E9E"/>
-                <w:sz w:val="20"/>
-                <w:szCs w:val="20"/>
-                <w:lang w:val="en-US"/>
-              </w:rPr>
-              <w:t>primary</w:t>
-            </w:r>
-            <w:proofErr w:type="spellEnd"/>
-            <w:r>
-              <w:rPr>
-                <w:i/>
-                <w:iCs/>
-                <w:color w:val="9E9E9E"/>
-                <w:sz w:val="20"/>
-                <w:szCs w:val="20"/>
-                <w:lang w:val="en-US"/>
-              </w:rPr>
-              <w:t>(</w:t>
-            </w:r>
-            <w:proofErr w:type="gramEnd"/>
-            <w:r>
-              <w:rPr>
-                <w:i/>
-                <w:iCs/>
-                <w:color w:val="9E9E9E"/>
-                <w:sz w:val="20"/>
-                <w:szCs w:val="20"/>
-                <w:lang w:val="en-US"/>
-              </w:rPr>
-              <w:t>t + 6h)</w:t>
-            </w:r>
-          </w:p>
-        </w:tc>
-      </w:tr>
-      <w:tr>
-        <w:tblPrEx>
-          <w:tblCellMar>
-            <w:top w:w="0" w:type="dxa"/>
-            <w:bottom w:w="0" w:type="dxa"/>
-          </w:tblCellMar>
-        </w:tblPrEx>
-        <w:tc>
-          <w:tcPr>
-            <w:tcW w:w="3000" w:type="dxa"/>
-            <w:tcBorders>
-              <w:top w:val="single" w:sz="1" w:space="0" w:color="CCCCCC"/>
-              <w:left w:val="single" w:sz="1" w:space="0" w:color="CCCCCC"/>
-              <w:bottom w:val="single" w:sz="1" w:space="0" w:color="CCCCCC"/>
-              <w:right w:val="single" w:sz="1" w:space="0" w:color="CCCCCC"/>
-            </w:tcBorders>
-            <w:shd w:val="clear" w:color="auto" w:fill="F5F5F5"/>
-            <w:tcMar>
-              <w:top w:w="60" w:type="dxa"/>
-              <w:left w:w="100" w:type="dxa"/>
-              <w:bottom w:w="60" w:type="dxa"/>
-              <w:right w:w="100" w:type="dxa"/>
-            </w:tcMar>
-          </w:tcPr>
-          <w:p>
-            <w:r>
-              <w:rPr>
-                <w:b/>
-                <w:bCs/>
-                <w:sz w:val="20"/>
-                <w:szCs w:val="20"/>
-              </w:rPr>
-              <w:t>Горизонт прогноза</w:t>
-            </w:r>
-          </w:p>
-        </w:tc>
-        <w:tc>
-          <w:tcPr>
-            <w:tcW w:w="6026" w:type="dxa"/>
-            <w:tcBorders>
-              <w:top w:val="single" w:sz="1" w:space="0" w:color="CCCCCC"/>
-              <w:left w:val="single" w:sz="1" w:space="0" w:color="CCCCCC"/>
-              <w:bottom w:val="single" w:sz="1" w:space="0" w:color="CCCCCC"/>
-              <w:right w:val="single" w:sz="1" w:space="0" w:color="CCCCCC"/>
-            </w:tcBorders>
-            <w:tcMar>
-              <w:top w:w="60" w:type="dxa"/>
-              <w:left w:w="100" w:type="dxa"/>
-              <w:bottom w:w="60" w:type="dxa"/>
-              <w:right w:w="100" w:type="dxa"/>
-            </w:tcMar>
-          </w:tcPr>
-          <w:p>
-            <w:r>
-              <w:rPr>
-                <w:i/>
-                <w:iCs/>
-                <w:color w:val="9E9E9E"/>
-                <w:sz w:val="20"/>
-                <w:szCs w:val="20"/>
-              </w:rPr>
-              <w:t>6 часов</w:t>
-            </w:r>
-          </w:p>
-        </w:tc>
-      </w:tr>
-      <w:tr>
-        <w:tblPrEx>
-          <w:tblCellMar>
-            <w:top w:w="0" w:type="dxa"/>
-            <w:bottom w:w="0" w:type="dxa"/>
-          </w:tblCellMar>
-        </w:tblPrEx>
-        <w:tc>
-          <w:tcPr>
-            <w:tcW w:w="3000" w:type="dxa"/>
-            <w:tcBorders>
-              <w:top w:val="single" w:sz="1" w:space="0" w:color="CCCCCC"/>
-              <w:left w:val="single" w:sz="1" w:space="0" w:color="CCCCCC"/>
-              <w:bottom w:val="single" w:sz="1" w:space="0" w:color="CCCCCC"/>
-              <w:right w:val="single" w:sz="1" w:space="0" w:color="CCCCCC"/>
-            </w:tcBorders>
-            <w:shd w:val="clear" w:color="auto" w:fill="F5F5F5"/>
-            <w:tcMar>
-              <w:top w:w="60" w:type="dxa"/>
-              <w:left w:w="100" w:type="dxa"/>
-              <w:bottom w:w="60" w:type="dxa"/>
-              <w:right w:w="100" w:type="dxa"/>
-            </w:tcMar>
-          </w:tcPr>
-          <w:p>
-            <w:r>
-              <w:rPr>
-                <w:b/>
-                <w:bCs/>
-                <w:sz w:val="20"/>
-                <w:szCs w:val="20"/>
-              </w:rPr>
-              <w:t>Частота обновления</w:t>
-            </w:r>
-          </w:p>
-        </w:tc>
-        <w:tc>
-          <w:tcPr>
-            <w:tcW w:w="6026" w:type="dxa"/>
-            <w:tcBorders>
-              <w:top w:val="single" w:sz="1" w:space="0" w:color="CCCCCC"/>
-              <w:left w:val="single" w:sz="1" w:space="0" w:color="CCCCCC"/>
-              <w:bottom w:val="single" w:sz="1" w:space="0" w:color="CCCCCC"/>
-              <w:right w:val="single" w:sz="1" w:space="0" w:color="CCCCCC"/>
-            </w:tcBorders>
-            <w:tcMar>
-              <w:top w:w="60" w:type="dxa"/>
-              <w:left w:w="100" w:type="dxa"/>
-              <w:bottom w:w="60" w:type="dxa"/>
-              <w:right w:w="100" w:type="dxa"/>
-            </w:tcMar>
-          </w:tcPr>
-          <w:p>
-            <w:r>
-              <w:rPr>
-                <w:i/>
-                <w:iCs/>
-                <w:color w:val="9E9E9E"/>
-                <w:sz w:val="20"/>
-                <w:szCs w:val="20"/>
-              </w:rPr>
-              <w:t>Каждые 15 минут</w:t>
-            </w:r>
-          </w:p>
-        </w:tc>
-      </w:tr>
-    </w:tbl>
     <w:p>
       <w:pPr>
-        <w:pStyle w:val="2"/>
+        <w:pStyle w:val="font-claude-response-body"/>
       </w:pPr>
       <w:r>
-        <w:t>4.1. Критерии успеха</w:t>
+        <w:t>Используйте формальную постановку из project_brief_supplement.md раздел 4.1:</w:t>
       </w:r>
     </w:p>
-    <w:tbl>
-      <w:tblPr>
-        <w:tblW w:w="9026" w:type="dxa"/>
-        <w:tblBorders>
-          <w:top w:val="single" w:sz="4" w:space="0" w:color="auto"/>
-          <w:left w:val="single" w:sz="4" w:space="0" w:color="auto"/>
-          <w:bottom w:val="single" w:sz="4" w:space="0" w:color="auto"/>
-          <w:right w:val="single" w:sz="4" w:space="0" w:color="auto"/>
-          <w:insideH w:val="single" w:sz="4" w:space="0" w:color="auto"/>
-          <w:insideV w:val="single" w:sz="4" w:space="0" w:color="auto"/>
-        </w:tblBorders>
-        <w:tblCellMar>
-          <w:left w:w="10" w:type="dxa"/>
-          <w:right w:w="10" w:type="dxa"/>
-        </w:tblCellMar>
-        <w:tblLook w:val="04A0" w:firstRow="1" w:lastRow="0" w:firstColumn="1" w:lastColumn="0" w:noHBand="0" w:noVBand="1"/>
-      </w:tblPr>
-      <w:tblGrid>
-        <w:gridCol w:w="2000"/>
-        <w:gridCol w:w="4526"/>
-        <w:gridCol w:w="2500"/>
-      </w:tblGrid>
-      <w:tr>
-        <w:tblPrEx>
-          <w:tblCellMar>
-            <w:top w:w="0" w:type="dxa"/>
-            <w:bottom w:w="0" w:type="dxa"/>
-          </w:tblCellMar>
-        </w:tblPrEx>
-        <w:tc>
-          <w:tcPr>
-            <w:tcW w:w="2000" w:type="dxa"/>
-            <w:tcBorders>
-              <w:top w:val="single" w:sz="1" w:space="0" w:color="CCCCCC"/>
-              <w:left w:val="single" w:sz="1" w:space="0" w:color="CCCCCC"/>
-              <w:bottom w:val="single" w:sz="1" w:space="0" w:color="CCCCCC"/>
-              <w:right w:val="single" w:sz="1" w:space="0" w:color="CCCCCC"/>
-            </w:tcBorders>
-            <w:shd w:val="clear" w:color="auto" w:fill="1565C0"/>
-            <w:tcMar>
-              <w:top w:w="60" w:type="dxa"/>
-              <w:left w:w="100" w:type="dxa"/>
-              <w:bottom w:w="60" w:type="dxa"/>
-              <w:right w:w="100" w:type="dxa"/>
-            </w:tcMar>
-          </w:tcPr>
-          <w:p>
-            <w:r>
-              <w:rPr>
-                <w:b/>
-                <w:bCs/>
-                <w:color w:val="FFFFFF"/>
-                <w:sz w:val="20"/>
-                <w:szCs w:val="20"/>
-              </w:rPr>
-              <w:t>Уровень</w:t>
-            </w:r>
-          </w:p>
-        </w:tc>
-        <w:tc>
-          <w:tcPr>
-            <w:tcW w:w="4526" w:type="dxa"/>
-            <w:tcBorders>
-              <w:top w:val="single" w:sz="1" w:space="0" w:color="CCCCCC"/>
-              <w:left w:val="single" w:sz="1" w:space="0" w:color="CCCCCC"/>
-              <w:bottom w:val="single" w:sz="1" w:space="0" w:color="CCCCCC"/>
-              <w:right w:val="single" w:sz="1" w:space="0" w:color="CCCCCC"/>
-            </w:tcBorders>
-            <w:shd w:val="clear" w:color="auto" w:fill="1565C0"/>
-            <w:tcMar>
-              <w:top w:w="60" w:type="dxa"/>
-              <w:left w:w="100" w:type="dxa"/>
-              <w:bottom w:w="60" w:type="dxa"/>
-              <w:right w:w="100" w:type="dxa"/>
-            </w:tcMar>
-          </w:tcPr>
-          <w:p>
-            <w:r>
-              <w:rPr>
-                <w:b/>
-                <w:bCs/>
-                <w:color w:val="FFFFFF"/>
-                <w:sz w:val="20"/>
-                <w:szCs w:val="20"/>
-              </w:rPr>
-              <w:t>Критерий</w:t>
-            </w:r>
-          </w:p>
-        </w:tc>
-        <w:tc>
-          <w:tcPr>
-            <w:tcW w:w="2500" w:type="dxa"/>
-            <w:tcBorders>
-              <w:top w:val="single" w:sz="1" w:space="0" w:color="CCCCCC"/>
-              <w:left w:val="single" w:sz="1" w:space="0" w:color="CCCCCC"/>
-              <w:bottom w:val="single" w:sz="1" w:space="0" w:color="CCCCCC"/>
-              <w:right w:val="single" w:sz="1" w:space="0" w:color="CCCCCC"/>
-            </w:tcBorders>
-            <w:shd w:val="clear" w:color="auto" w:fill="1565C0"/>
-            <w:tcMar>
-              <w:top w:w="60" w:type="dxa"/>
-              <w:left w:w="100" w:type="dxa"/>
-              <w:bottom w:w="60" w:type="dxa"/>
-              <w:right w:w="100" w:type="dxa"/>
-            </w:tcMar>
-          </w:tcPr>
-          <w:p>
-            <w:r>
-              <w:rPr>
-                <w:b/>
-                <w:bCs/>
-                <w:color w:val="FFFFFF"/>
-                <w:sz w:val="20"/>
-                <w:szCs w:val="20"/>
-              </w:rPr>
-              <w:t>Метод проверки</w:t>
-            </w:r>
-          </w:p>
-        </w:tc>
-      </w:tr>
-      <w:tr>
-        <w:tblPrEx>
-          <w:tblCellMar>
-            <w:top w:w="0" w:type="dxa"/>
-            <w:bottom w:w="0" w:type="dxa"/>
-          </w:tblCellMar>
-        </w:tblPrEx>
-        <w:tc>
-          <w:tcPr>
-            <w:tcW w:w="2000" w:type="dxa"/>
-            <w:tcBorders>
-              <w:top w:val="single" w:sz="1" w:space="0" w:color="CCCCCC"/>
-              <w:left w:val="single" w:sz="1" w:space="0" w:color="CCCCCC"/>
-              <w:bottom w:val="single" w:sz="1" w:space="0" w:color="CCCCCC"/>
-              <w:right w:val="single" w:sz="1" w:space="0" w:color="CCCCCC"/>
-            </w:tcBorders>
-            <w:tcMar>
-              <w:top w:w="60" w:type="dxa"/>
-              <w:left w:w="100" w:type="dxa"/>
-              <w:bottom w:w="60" w:type="dxa"/>
-              <w:right w:w="100" w:type="dxa"/>
-            </w:tcMar>
-          </w:tcPr>
-          <w:p>
-            <w:proofErr w:type="spellStart"/>
-            <w:r>
-              <w:rPr>
-                <w:sz w:val="20"/>
-                <w:szCs w:val="20"/>
-              </w:rPr>
-              <w:t>Technical</w:t>
-            </w:r>
-            <w:proofErr w:type="spellEnd"/>
-          </w:p>
-        </w:tc>
-        <w:tc>
-          <w:tcPr>
-            <w:tcW w:w="4526" w:type="dxa"/>
-            <w:tcBorders>
-              <w:top w:val="single" w:sz="1" w:space="0" w:color="CCCCCC"/>
-              <w:left w:val="single" w:sz="1" w:space="0" w:color="CCCCCC"/>
-              <w:bottom w:val="single" w:sz="1" w:space="0" w:color="CCCCCC"/>
-              <w:right w:val="single" w:sz="1" w:space="0" w:color="CCCCCC"/>
-            </w:tcBorders>
-            <w:tcMar>
-              <w:top w:w="60" w:type="dxa"/>
-              <w:left w:w="100" w:type="dxa"/>
-              <w:bottom w:w="60" w:type="dxa"/>
-              <w:right w:w="100" w:type="dxa"/>
-            </w:tcMar>
-          </w:tcPr>
-          <w:p>
-            <w:r>
-              <w:rPr>
-                <w:sz w:val="20"/>
-                <w:szCs w:val="20"/>
-              </w:rPr>
-              <w:t xml:space="preserve">MAE </w:t>
-            </w:r>
-            <w:proofErr w:type="gramStart"/>
-            <w:r>
-              <w:rPr>
-                <w:sz w:val="20"/>
-                <w:szCs w:val="20"/>
-              </w:rPr>
-              <w:t>&lt; 2</w:t>
-            </w:r>
-            <w:proofErr w:type="gramEnd"/>
-            <w:r>
-              <w:rPr>
-                <w:sz w:val="20"/>
-                <w:szCs w:val="20"/>
-              </w:rPr>
-              <w:t>°С на горизонте 6h</w:t>
-            </w:r>
-          </w:p>
-        </w:tc>
-        <w:tc>
-          <w:tcPr>
-            <w:tcW w:w="2500" w:type="dxa"/>
-            <w:tcBorders>
-              <w:top w:val="single" w:sz="1" w:space="0" w:color="CCCCCC"/>
-              <w:left w:val="single" w:sz="1" w:space="0" w:color="CCCCCC"/>
-              <w:bottom w:val="single" w:sz="1" w:space="0" w:color="CCCCCC"/>
-              <w:right w:val="single" w:sz="1" w:space="0" w:color="CCCCCC"/>
-            </w:tcBorders>
-            <w:tcMar>
-              <w:top w:w="60" w:type="dxa"/>
-              <w:left w:w="100" w:type="dxa"/>
-              <w:bottom w:w="60" w:type="dxa"/>
-              <w:right w:w="100" w:type="dxa"/>
-            </w:tcMar>
-          </w:tcPr>
-          <w:p>
-            <w:proofErr w:type="spellStart"/>
-            <w:r>
-              <w:rPr>
-                <w:sz w:val="20"/>
-                <w:szCs w:val="20"/>
-              </w:rPr>
-              <w:t>Walk-forward</w:t>
-            </w:r>
-            <w:proofErr w:type="spellEnd"/>
-            <w:r>
-              <w:rPr>
-                <w:sz w:val="20"/>
-                <w:szCs w:val="20"/>
-              </w:rPr>
-              <w:t xml:space="preserve"> CV</w:t>
-            </w:r>
-          </w:p>
-        </w:tc>
-      </w:tr>
-      <w:tr>
-        <w:tblPrEx>
-          <w:tblCellMar>
-            <w:top w:w="0" w:type="dxa"/>
-            <w:bottom w:w="0" w:type="dxa"/>
-          </w:tblCellMar>
-        </w:tblPrEx>
-        <w:tc>
-          <w:tcPr>
-            <w:tcW w:w="2000" w:type="dxa"/>
-            <w:tcBorders>
-              <w:top w:val="single" w:sz="1" w:space="0" w:color="CCCCCC"/>
-              <w:left w:val="single" w:sz="1" w:space="0" w:color="CCCCCC"/>
-              <w:bottom w:val="single" w:sz="1" w:space="0" w:color="CCCCCC"/>
-              <w:right w:val="single" w:sz="1" w:space="0" w:color="CCCCCC"/>
-            </w:tcBorders>
-            <w:shd w:val="clear" w:color="auto" w:fill="F5F5F5"/>
-            <w:tcMar>
-              <w:top w:w="60" w:type="dxa"/>
-              <w:left w:w="100" w:type="dxa"/>
-              <w:bottom w:w="60" w:type="dxa"/>
-              <w:right w:w="100" w:type="dxa"/>
-            </w:tcMar>
-          </w:tcPr>
-          <w:p>
-            <w:r>
-              <w:rPr>
-                <w:sz w:val="20"/>
-                <w:szCs w:val="20"/>
-              </w:rPr>
-              <w:t>Business</w:t>
-            </w:r>
-          </w:p>
-        </w:tc>
-        <w:tc>
-          <w:tcPr>
-            <w:tcW w:w="4526" w:type="dxa"/>
-            <w:tcBorders>
-              <w:top w:val="single" w:sz="1" w:space="0" w:color="CCCCCC"/>
-              <w:left w:val="single" w:sz="1" w:space="0" w:color="CCCCCC"/>
-              <w:bottom w:val="single" w:sz="1" w:space="0" w:color="CCCCCC"/>
-              <w:right w:val="single" w:sz="1" w:space="0" w:color="CCCCCC"/>
-            </w:tcBorders>
-            <w:shd w:val="clear" w:color="auto" w:fill="F5F5F5"/>
-            <w:tcMar>
-              <w:top w:w="60" w:type="dxa"/>
-              <w:left w:w="100" w:type="dxa"/>
-              <w:bottom w:w="60" w:type="dxa"/>
-              <w:right w:w="100" w:type="dxa"/>
-            </w:tcMar>
-          </w:tcPr>
-          <w:p>
-            <w:proofErr w:type="spellStart"/>
-            <w:r>
-              <w:rPr>
-                <w:sz w:val="20"/>
-                <w:szCs w:val="20"/>
-              </w:rPr>
-              <w:t>energy_per_HDD</w:t>
-            </w:r>
-            <w:proofErr w:type="spellEnd"/>
-            <w:r>
-              <w:rPr>
-                <w:sz w:val="20"/>
-                <w:szCs w:val="20"/>
-              </w:rPr>
-              <w:t xml:space="preserve"> ↓ ≥ 5%</w:t>
-            </w:r>
-          </w:p>
-        </w:tc>
-        <w:tc>
-          <w:tcPr>
-            <w:tcW w:w="2500" w:type="dxa"/>
-            <w:tcBorders>
-              <w:top w:val="single" w:sz="1" w:space="0" w:color="CCCCCC"/>
-              <w:left w:val="single" w:sz="1" w:space="0" w:color="CCCCCC"/>
-              <w:bottom w:val="single" w:sz="1" w:space="0" w:color="CCCCCC"/>
-              <w:right w:val="single" w:sz="1" w:space="0" w:color="CCCCCC"/>
-            </w:tcBorders>
-            <w:shd w:val="clear" w:color="auto" w:fill="F5F5F5"/>
-            <w:tcMar>
-              <w:top w:w="60" w:type="dxa"/>
-              <w:left w:w="100" w:type="dxa"/>
-              <w:bottom w:w="60" w:type="dxa"/>
-              <w:right w:w="100" w:type="dxa"/>
-            </w:tcMar>
-          </w:tcPr>
-          <w:p>
-            <w:proofErr w:type="spellStart"/>
-            <w:r>
-              <w:rPr>
-                <w:sz w:val="20"/>
-                <w:szCs w:val="20"/>
-              </w:rPr>
-              <w:t>Backtesting</w:t>
-            </w:r>
-            <w:proofErr w:type="spellEnd"/>
-          </w:p>
-        </w:tc>
-      </w:tr>
-      <w:tr>
-        <w:tblPrEx>
-          <w:tblCellMar>
-            <w:top w:w="0" w:type="dxa"/>
-            <w:bottom w:w="0" w:type="dxa"/>
-          </w:tblCellMar>
-        </w:tblPrEx>
-        <w:tc>
-          <w:tcPr>
-            <w:tcW w:w="2000" w:type="dxa"/>
-            <w:tcBorders>
-              <w:top w:val="single" w:sz="1" w:space="0" w:color="CCCCCC"/>
-              <w:left w:val="single" w:sz="1" w:space="0" w:color="CCCCCC"/>
-              <w:bottom w:val="single" w:sz="1" w:space="0" w:color="CCCCCC"/>
-              <w:right w:val="single" w:sz="1" w:space="0" w:color="CCCCCC"/>
-            </w:tcBorders>
-            <w:tcMar>
-              <w:top w:w="60" w:type="dxa"/>
-              <w:left w:w="100" w:type="dxa"/>
-              <w:bottom w:w="60" w:type="dxa"/>
-              <w:right w:w="100" w:type="dxa"/>
-            </w:tcMar>
-          </w:tcPr>
-          <w:p>
-            <w:r>
-              <w:rPr>
-                <w:sz w:val="20"/>
-                <w:szCs w:val="20"/>
-              </w:rPr>
-              <w:t>Pilot</w:t>
-            </w:r>
-          </w:p>
-        </w:tc>
-        <w:tc>
-          <w:tcPr>
-            <w:tcW w:w="4526" w:type="dxa"/>
-            <w:tcBorders>
-              <w:top w:val="single" w:sz="1" w:space="0" w:color="CCCCCC"/>
-              <w:left w:val="single" w:sz="1" w:space="0" w:color="CCCCCC"/>
-              <w:bottom w:val="single" w:sz="1" w:space="0" w:color="CCCCCC"/>
-              <w:right w:val="single" w:sz="1" w:space="0" w:color="CCCCCC"/>
-            </w:tcBorders>
-            <w:tcMar>
-              <w:top w:w="60" w:type="dxa"/>
-              <w:left w:w="100" w:type="dxa"/>
-              <w:bottom w:w="60" w:type="dxa"/>
-              <w:right w:w="100" w:type="dxa"/>
-            </w:tcMar>
-          </w:tcPr>
-          <w:p>
-            <w:r>
-              <w:rPr>
-                <w:sz w:val="20"/>
-                <w:szCs w:val="20"/>
-              </w:rPr>
-              <w:t xml:space="preserve">p </w:t>
-            </w:r>
-            <w:proofErr w:type="gramStart"/>
-            <w:r>
-              <w:rPr>
-                <w:sz w:val="20"/>
-                <w:szCs w:val="20"/>
-              </w:rPr>
-              <w:t>&lt; 0.05</w:t>
-            </w:r>
-            <w:proofErr w:type="gramEnd"/>
-            <w:r>
-              <w:rPr>
-                <w:sz w:val="20"/>
-                <w:szCs w:val="20"/>
-              </w:rPr>
-              <w:t xml:space="preserve"> (</w:t>
-            </w:r>
-            <w:proofErr w:type="spellStart"/>
-            <w:r>
-              <w:rPr>
-                <w:sz w:val="20"/>
-                <w:szCs w:val="20"/>
-              </w:rPr>
-              <w:t>Welch</w:t>
-            </w:r>
-            <w:proofErr w:type="spellEnd"/>
-            <w:r>
-              <w:rPr>
-                <w:sz w:val="20"/>
-                <w:szCs w:val="20"/>
-              </w:rPr>
-              <w:t xml:space="preserve"> t-</w:t>
-            </w:r>
-            <w:proofErr w:type="spellStart"/>
-            <w:r>
-              <w:rPr>
-                <w:sz w:val="20"/>
-                <w:szCs w:val="20"/>
-              </w:rPr>
-              <w:t>test</w:t>
-            </w:r>
-            <w:proofErr w:type="spellEnd"/>
-            <w:r>
-              <w:rPr>
-                <w:sz w:val="20"/>
-                <w:szCs w:val="20"/>
-              </w:rPr>
-              <w:t>)</w:t>
-            </w:r>
-          </w:p>
-        </w:tc>
-        <w:tc>
-          <w:tcPr>
-            <w:tcW w:w="2500" w:type="dxa"/>
-            <w:tcBorders>
-              <w:top w:val="single" w:sz="1" w:space="0" w:color="CCCCCC"/>
-              <w:left w:val="single" w:sz="1" w:space="0" w:color="CCCCCC"/>
-              <w:bottom w:val="single" w:sz="1" w:space="0" w:color="CCCCCC"/>
-              <w:right w:val="single" w:sz="1" w:space="0" w:color="CCCCCC"/>
-            </w:tcBorders>
-            <w:tcMar>
-              <w:top w:w="60" w:type="dxa"/>
-              <w:left w:w="100" w:type="dxa"/>
-              <w:bottom w:w="60" w:type="dxa"/>
-              <w:right w:w="100" w:type="dxa"/>
-            </w:tcMar>
-          </w:tcPr>
-          <w:p>
-            <w:proofErr w:type="spellStart"/>
-            <w:r>
-              <w:rPr>
-                <w:sz w:val="20"/>
-                <w:szCs w:val="20"/>
-              </w:rPr>
-              <w:t>Switchback</w:t>
-            </w:r>
-            <w:proofErr w:type="spellEnd"/>
-            <w:r>
-              <w:rPr>
-                <w:sz w:val="20"/>
-                <w:szCs w:val="20"/>
-              </w:rPr>
-              <w:t xml:space="preserve"> A/B</w:t>
-            </w:r>
-          </w:p>
-        </w:tc>
-      </w:tr>
-    </w:tbl>
     <w:p>
-      <w:r>
-        <w:br w:type="page"/>
+      <w:pPr>
+        <w:pStyle w:val="whitespace-normal"/>
+        <w:numPr>
+          <w:ilvl w:val="0"/>
+          <w:numId w:val="2"/>
+        </w:numPr>
+      </w:pPr>
+      <w:r>
+        <w:t>Дано: X(t), H(t), F(</w:t>
+      </w:r>
+      <w:proofErr w:type="spellStart"/>
+      <w:r>
+        <w:t>t+h</w:t>
+      </w:r>
+      <w:proofErr w:type="spellEnd"/>
+      <w:r>
+        <w:t xml:space="preserve">), h </w:t>
+      </w:r>
+      <w:r>
+        <w:rPr>
+          <w:rFonts w:ascii="Cambria Math" w:hAnsi="Cambria Math" w:cs="Cambria Math"/>
+        </w:rPr>
+        <w:t>∈</w:t>
+      </w:r>
+      <w:r>
+        <w:t xml:space="preserve"> {6, 12, 24}</w:t>
+      </w:r>
+    </w:p>
+    <w:p>
+      <w:pPr>
+        <w:pStyle w:val="whitespace-normal"/>
+        <w:numPr>
+          <w:ilvl w:val="0"/>
+          <w:numId w:val="2"/>
+        </w:numPr>
+      </w:pPr>
+      <w:r>
+        <w:t>Найти: f: H(t) → ŷ(</w:t>
+      </w:r>
+      <w:proofErr w:type="spellStart"/>
+      <w:r>
+        <w:t>t+h</w:t>
+      </w:r>
+      <w:proofErr w:type="spellEnd"/>
+      <w:r>
+        <w:t>)</w:t>
+      </w:r>
+    </w:p>
+    <w:p>
+      <w:pPr>
+        <w:pStyle w:val="whitespace-normal"/>
+        <w:numPr>
+          <w:ilvl w:val="0"/>
+          <w:numId w:val="2"/>
+        </w:numPr>
+      </w:pPr>
+      <w:r>
+        <w:t xml:space="preserve">Ограничения: </w:t>
+      </w:r>
+      <w:proofErr w:type="spellStart"/>
+      <w:r>
+        <w:t>guardrail</w:t>
+      </w:r>
+      <w:proofErr w:type="spellEnd"/>
+    </w:p>
+    <w:p>
+      <w:pPr>
+        <w:pStyle w:val="whitespace-normal"/>
+        <w:numPr>
+          <w:ilvl w:val="0"/>
+          <w:numId w:val="2"/>
+        </w:numPr>
+      </w:pPr>
+      <w:r>
+        <w:t xml:space="preserve">Критерии: MAE </w:t>
+      </w:r>
+      <w:proofErr w:type="gramStart"/>
+      <w:r>
+        <w:t>&lt; 2</w:t>
+      </w:r>
+      <w:proofErr w:type="gramEnd"/>
+      <w:r>
+        <w:t xml:space="preserve">°C, PI </w:t>
+      </w:r>
+      <w:proofErr w:type="spellStart"/>
+      <w:r>
+        <w:t>coverage</w:t>
+      </w:r>
+      <w:proofErr w:type="spellEnd"/>
+      <w:r>
+        <w:t xml:space="preserve"> ≥ 90%, экономия ≥ 5%</w:t>
+      </w:r>
+    </w:p>
+    <w:p>
+      <w:pPr>
+        <w:pStyle w:val="whitespace-normal"/>
+      </w:pPr>
+      <w:r>
+        <w:t xml:space="preserve">MAE интерпретируемо </w:t>
+      </w:r>
+      <w:proofErr w:type="gramStart"/>
+      <w:r>
+        <w:t>в °C</w:t>
+      </w:r>
+      <w:proofErr w:type="gramEnd"/>
+      <w:r>
+        <w:t xml:space="preserve"> (средняя ошибка = X градусов). MSE даёт единицы °C², что менее понятно оператору. MAE менее чувствительно к выбросам при пуске/останове, что соответствует бизнес-логике (штрафовать за стабильную ошибку 2°C, а не за редкий выброс 10°C при пуске).</w:t>
       </w:r>
     </w:p>
     <w:p>
@@ -5353,7 +4650,6 @@
         <w:pStyle w:val="1"/>
       </w:pPr>
       <w:r>
-        <w:lastRenderedPageBreak/>
         <w:t>5. Данные и доступность</w:t>
       </w:r>
     </w:p>
@@ -15286,6 +14582,155 @@
 <file path=word/numbering.xml><?xml version="1.0" encoding="utf-8"?>
 <w:numbering xmlns:wpc="http://schemas.microsoft.com/office/word/2010/wordprocessingCanvas" xmlns:cx="http://schemas.microsoft.com/office/drawing/2014/chartex" xmlns:cx1="http://schemas.microsoft.com/office/drawing/2015/9/8/chartex" xmlns:cx2="http://schemas.microsoft.com/office/drawing/2015/10/21/chartex" xmlns:cx3="http://schemas.microsoft.com/office/drawing/2016/5/9/chartex" xmlns:cx4="http://schemas.microsoft.com/office/drawing/2016/5/10/chartex" xmlns:cx5="http://schemas.microsoft.com/office/drawing/2016/5/11/chartex" xmlns:cx6="http://schemas.microsoft.com/office/drawing/2016/5/12/chartex" xmlns:cx7="http://schemas.microsoft.com/office/drawing/2016/5/13/chartex" xmlns:cx8="http://schemas.microsoft.com/office/drawing/2016/5/14/chartex" xmlns:mc="http://schemas.openxmlformats.org/markup-compatibility/2006" xmlns:aink="http://schemas.microsoft.com/office/drawing/2016/ink" xmlns:am3d="http://schemas.microsoft.com/office/drawing/2017/model3d" xmlns:o="urn:schemas-microsoft-com:office:office" xmlns:r="http://schemas.openxmlformats.org/officeDocument/2006/relationships" xmlns:m="http://schemas.openxmlformats.org/officeDocument/2006/math" xmlns:v="urn:schemas-microsoft-com:vml" xmlns:wp14="http://schemas.microsoft.com/office/word/2010/wordprocessingDrawing" xmlns:wp="http://schemas.openxmlformats.org/drawingml/2006/wordprocessingDrawing" xmlns:w10="urn:schemas-microsoft-com:office:word" xmlns:w="http://schemas.openxmlformats.org/wordprocessingml/2006/main" xmlns:w14="http://schemas.microsoft.com/office/word/2010/wordml" xmlns:w15="http://schemas.microsoft.com/office/word/2012/wordml" xmlns:w16cex="http://schemas.microsoft.com/office/word/2018/wordml/cex" xmlns:w16cid="http://schemas.microsoft.com/office/word/2016/wordml/cid" xmlns:w16="http://schemas.microsoft.com/office/word/2018/wordml" xmlns:w16sdtdh="http://schemas.microsoft.com/office/word/2020/wordml/sdtdatahash" xmlns:w16se="http://schemas.microsoft.com/office/word/2015/wordml/symex" xmlns:wpg="http://schemas.microsoft.com/office/word/2010/wordprocessingGroup" xmlns:wpi="http://schemas.microsoft.com/office/word/2010/wordprocessingInk" xmlns:wne="http://schemas.microsoft.com/office/word/2006/wordml" xmlns:wps="http://schemas.microsoft.com/office/word/2010/wordprocessingShape" mc:Ignorable="w14 w15 w16se w16cid w16 w16cex w16sdtdh wp14">
   <w:abstractNum w:abstractNumId="0" w15:restartNumberingAfterBreak="0">
+    <w:nsid w:val="025B1C9A"/>
+    <w:multiLevelType w:val="multilevel"/>
+    <w:tmpl w:val="02A49808"/>
+    <w:lvl w:ilvl="0">
+      <w:start w:val="1"/>
+      <w:numFmt w:val="bullet"/>
+      <w:lvlText w:val=""/>
+      <w:lvlJc w:val="left"/>
+      <w:pPr>
+        <w:tabs>
+          <w:tab w:val="num" w:pos="720"/>
+        </w:tabs>
+        <w:ind w:left="720" w:hanging="360"/>
+      </w:pPr>
+      <w:rPr>
+        <w:rFonts w:ascii="Symbol" w:hAnsi="Symbol" w:hint="default"/>
+        <w:sz w:val="20"/>
+      </w:rPr>
+    </w:lvl>
+    <w:lvl w:ilvl="1" w:tentative="1">
+      <w:start w:val="1"/>
+      <w:numFmt w:val="bullet"/>
+      <w:lvlText w:val="o"/>
+      <w:lvlJc w:val="left"/>
+      <w:pPr>
+        <w:tabs>
+          <w:tab w:val="num" w:pos="1440"/>
+        </w:tabs>
+        <w:ind w:left="1440" w:hanging="360"/>
+      </w:pPr>
+      <w:rPr>
+        <w:rFonts w:ascii="Courier New" w:hAnsi="Courier New" w:hint="default"/>
+        <w:sz w:val="20"/>
+      </w:rPr>
+    </w:lvl>
+    <w:lvl w:ilvl="2" w:tentative="1">
+      <w:start w:val="1"/>
+      <w:numFmt w:val="bullet"/>
+      <w:lvlText w:val=""/>
+      <w:lvlJc w:val="left"/>
+      <w:pPr>
+        <w:tabs>
+          <w:tab w:val="num" w:pos="2160"/>
+        </w:tabs>
+        <w:ind w:left="2160" w:hanging="360"/>
+      </w:pPr>
+      <w:rPr>
+        <w:rFonts w:ascii="Wingdings" w:hAnsi="Wingdings" w:hint="default"/>
+        <w:sz w:val="20"/>
+      </w:rPr>
+    </w:lvl>
+    <w:lvl w:ilvl="3" w:tentative="1">
+      <w:start w:val="1"/>
+      <w:numFmt w:val="bullet"/>
+      <w:lvlText w:val=""/>
+      <w:lvlJc w:val="left"/>
+      <w:pPr>
+        <w:tabs>
+          <w:tab w:val="num" w:pos="2880"/>
+        </w:tabs>
+        <w:ind w:left="2880" w:hanging="360"/>
+      </w:pPr>
+      <w:rPr>
+        <w:rFonts w:ascii="Wingdings" w:hAnsi="Wingdings" w:hint="default"/>
+        <w:sz w:val="20"/>
+      </w:rPr>
+    </w:lvl>
+    <w:lvl w:ilvl="4" w:tentative="1">
+      <w:start w:val="1"/>
+      <w:numFmt w:val="bullet"/>
+      <w:lvlText w:val=""/>
+      <w:lvlJc w:val="left"/>
+      <w:pPr>
+        <w:tabs>
+          <w:tab w:val="num" w:pos="3600"/>
+        </w:tabs>
+        <w:ind w:left="3600" w:hanging="360"/>
+      </w:pPr>
+      <w:rPr>
+        <w:rFonts w:ascii="Wingdings" w:hAnsi="Wingdings" w:hint="default"/>
+        <w:sz w:val="20"/>
+      </w:rPr>
+    </w:lvl>
+    <w:lvl w:ilvl="5" w:tentative="1">
+      <w:start w:val="1"/>
+      <w:numFmt w:val="bullet"/>
+      <w:lvlText w:val=""/>
+      <w:lvlJc w:val="left"/>
+      <w:pPr>
+        <w:tabs>
+          <w:tab w:val="num" w:pos="4320"/>
+        </w:tabs>
+        <w:ind w:left="4320" w:hanging="360"/>
+      </w:pPr>
+      <w:rPr>
+        <w:rFonts w:ascii="Wingdings" w:hAnsi="Wingdings" w:hint="default"/>
+        <w:sz w:val="20"/>
+      </w:rPr>
+    </w:lvl>
+    <w:lvl w:ilvl="6" w:tentative="1">
+      <w:start w:val="1"/>
+      <w:numFmt w:val="bullet"/>
+      <w:lvlText w:val=""/>
+      <w:lvlJc w:val="left"/>
+      <w:pPr>
+        <w:tabs>
+          <w:tab w:val="num" w:pos="5040"/>
+        </w:tabs>
+        <w:ind w:left="5040" w:hanging="360"/>
+      </w:pPr>
+      <w:rPr>
+        <w:rFonts w:ascii="Wingdings" w:hAnsi="Wingdings" w:hint="default"/>
+        <w:sz w:val="20"/>
+      </w:rPr>
+    </w:lvl>
+    <w:lvl w:ilvl="7" w:tentative="1">
+      <w:start w:val="1"/>
+      <w:numFmt w:val="bullet"/>
+      <w:lvlText w:val=""/>
+      <w:lvlJc w:val="left"/>
+      <w:pPr>
+        <w:tabs>
+          <w:tab w:val="num" w:pos="5760"/>
+        </w:tabs>
+        <w:ind w:left="5760" w:hanging="360"/>
+      </w:pPr>
+      <w:rPr>
+        <w:rFonts w:ascii="Wingdings" w:hAnsi="Wingdings" w:hint="default"/>
+        <w:sz w:val="20"/>
+      </w:rPr>
+    </w:lvl>
+    <w:lvl w:ilvl="8" w:tentative="1">
+      <w:start w:val="1"/>
+      <w:numFmt w:val="bullet"/>
+      <w:lvlText w:val=""/>
+      <w:lvlJc w:val="left"/>
+      <w:pPr>
+        <w:tabs>
+          <w:tab w:val="num" w:pos="6480"/>
+        </w:tabs>
+        <w:ind w:left="6480" w:hanging="360"/>
+      </w:pPr>
+      <w:rPr>
+        <w:rFonts w:ascii="Wingdings" w:hAnsi="Wingdings" w:hint="default"/>
+        <w:sz w:val="20"/>
+      </w:rPr>
+    </w:lvl>
+  </w:abstractNum>
+  <w:abstractNum w:abstractNumId="1" w15:restartNumberingAfterBreak="0">
     <w:nsid w:val="438766B4"/>
     <w:multiLevelType w:val="hybridMultilevel"/>
     <w:tmpl w:val="88A4A392"/>
@@ -15372,10 +14817,13 @@
     </w:lvl>
   </w:abstractNum>
   <w:num w:numId="1">
-    <w:abstractNumId w:val="0"/>
+    <w:abstractNumId w:val="1"/>
     <w:lvlOverride w:ilvl="0">
       <w:startOverride w:val="1"/>
     </w:lvlOverride>
+  </w:num>
+  <w:num w:numId="2">
+    <w:abstractNumId w:val="0"/>
   </w:num>
 </w:numbering>
 </file>
@@ -15952,6 +15400,32 @@
       <w:szCs w:val="20"/>
     </w:rPr>
   </w:style>
+  <w:style w:type="paragraph" w:customStyle="1" w:styleId="font-claude-response-body">
+    <w:name w:val="font-claude-response-body"/>
+    <w:basedOn w:val="a"/>
+    <w:rsid w:val="008231AF"/>
+    <w:pPr>
+      <w:spacing w:before="100" w:beforeAutospacing="1" w:after="100" w:afterAutospacing="1"/>
+    </w:pPr>
+    <w:rPr>
+      <w:rFonts w:ascii="Times New Roman" w:eastAsia="Times New Roman" w:hAnsi="Times New Roman" w:cs="Times New Roman"/>
+      <w:sz w:val="24"/>
+      <w:szCs w:val="24"/>
+    </w:rPr>
+  </w:style>
+  <w:style w:type="paragraph" w:customStyle="1" w:styleId="whitespace-normal">
+    <w:name w:val="whitespace-normal"/>
+    <w:basedOn w:val="a"/>
+    <w:rsid w:val="008231AF"/>
+    <w:pPr>
+      <w:spacing w:before="100" w:beforeAutospacing="1" w:after="100" w:afterAutospacing="1"/>
+    </w:pPr>
+    <w:rPr>
+      <w:rFonts w:ascii="Times New Roman" w:eastAsia="Times New Roman" w:hAnsi="Times New Roman" w:cs="Times New Roman"/>
+      <w:sz w:val="24"/>
+      <w:szCs w:val="24"/>
+    </w:rPr>
+  </w:style>
 </w:styles>
 </file>
 

</xml_diff>

<commit_message>
docs: fill Brief section 6 (risks, assumptions, constraints)
</commit_message>
<xml_diff>
--- a/Project_Brief_Template_v2.docx
+++ b/Project_Brief_Template_v2.docx
@@ -6427,642 +6427,454 @@
         <w:t>Формат матрицы — PMI.</w:t>
       </w:r>
     </w:p>
-    <w:tbl>
-      <w:tblPr>
-        <w:tblW w:w="9026" w:type="dxa"/>
-        <w:tblBorders>
-          <w:top w:val="single" w:sz="4" w:space="0" w:color="auto"/>
-          <w:left w:val="single" w:sz="4" w:space="0" w:color="auto"/>
-          <w:bottom w:val="single" w:sz="4" w:space="0" w:color="auto"/>
-          <w:right w:val="single" w:sz="4" w:space="0" w:color="auto"/>
-          <w:insideH w:val="single" w:sz="4" w:space="0" w:color="auto"/>
-          <w:insideV w:val="single" w:sz="4" w:space="0" w:color="auto"/>
-        </w:tblBorders>
-        <w:tblCellMar>
-          <w:left w:w="10" w:type="dxa"/>
-          <w:right w:w="10" w:type="dxa"/>
-        </w:tblCellMar>
-        <w:tblLook w:val="04A0" w:firstRow="1" w:lastRow="0" w:firstColumn="1" w:lastColumn="0" w:noHBand="0" w:noVBand="1"/>
-      </w:tblPr>
-      <w:tblGrid>
-        <w:gridCol w:w="2800"/>
-        <w:gridCol w:w="1100"/>
-        <w:gridCol w:w="1100"/>
-        <w:gridCol w:w="4026"/>
-      </w:tblGrid>
-      <w:tr>
-        <w:tblPrEx>
-          <w:tblCellMar>
-            <w:top w:w="0" w:type="dxa"/>
-            <w:bottom w:w="0" w:type="dxa"/>
-          </w:tblCellMar>
-        </w:tblPrEx>
-        <w:tc>
-          <w:tcPr>
-            <w:tcW w:w="2800" w:type="dxa"/>
-            <w:tcBorders>
-              <w:top w:val="single" w:sz="1" w:space="0" w:color="CCCCCC"/>
-              <w:left w:val="single" w:sz="1" w:space="0" w:color="CCCCCC"/>
-              <w:bottom w:val="single" w:sz="1" w:space="0" w:color="CCCCCC"/>
-              <w:right w:val="single" w:sz="1" w:space="0" w:color="CCCCCC"/>
-            </w:tcBorders>
-            <w:shd w:val="clear" w:color="auto" w:fill="1565C0"/>
-            <w:tcMar>
-              <w:top w:w="60" w:type="dxa"/>
-              <w:left w:w="100" w:type="dxa"/>
-              <w:bottom w:w="60" w:type="dxa"/>
-              <w:right w:w="100" w:type="dxa"/>
-            </w:tcMar>
-          </w:tcPr>
-          <w:p>
-            <w:r>
-              <w:rPr>
-                <w:b/>
-                <w:bCs/>
-                <w:color w:val="FFFFFF"/>
-                <w:sz w:val="20"/>
-                <w:szCs w:val="20"/>
-              </w:rPr>
-              <w:t>Риск</w:t>
-            </w:r>
-          </w:p>
-        </w:tc>
-        <w:tc>
-          <w:tcPr>
-            <w:tcW w:w="1100" w:type="dxa"/>
-            <w:tcBorders>
-              <w:top w:val="single" w:sz="1" w:space="0" w:color="CCCCCC"/>
-              <w:left w:val="single" w:sz="1" w:space="0" w:color="CCCCCC"/>
-              <w:bottom w:val="single" w:sz="1" w:space="0" w:color="CCCCCC"/>
-              <w:right w:val="single" w:sz="1" w:space="0" w:color="CCCCCC"/>
-            </w:tcBorders>
-            <w:shd w:val="clear" w:color="auto" w:fill="1565C0"/>
-            <w:tcMar>
-              <w:top w:w="60" w:type="dxa"/>
-              <w:left w:w="100" w:type="dxa"/>
-              <w:bottom w:w="60" w:type="dxa"/>
-              <w:right w:w="100" w:type="dxa"/>
-            </w:tcMar>
-          </w:tcPr>
-          <w:p>
-            <w:r>
-              <w:rPr>
-                <w:b/>
-                <w:bCs/>
-                <w:color w:val="FFFFFF"/>
-                <w:sz w:val="20"/>
-                <w:szCs w:val="20"/>
-              </w:rPr>
-              <w:t>Вер.</w:t>
-            </w:r>
-          </w:p>
-        </w:tc>
-        <w:tc>
-          <w:tcPr>
-            <w:tcW w:w="1100" w:type="dxa"/>
-            <w:tcBorders>
-              <w:top w:val="single" w:sz="1" w:space="0" w:color="CCCCCC"/>
-              <w:left w:val="single" w:sz="1" w:space="0" w:color="CCCCCC"/>
-              <w:bottom w:val="single" w:sz="1" w:space="0" w:color="CCCCCC"/>
-              <w:right w:val="single" w:sz="1" w:space="0" w:color="CCCCCC"/>
-            </w:tcBorders>
-            <w:shd w:val="clear" w:color="auto" w:fill="1565C0"/>
-            <w:tcMar>
-              <w:top w:w="60" w:type="dxa"/>
-              <w:left w:w="100" w:type="dxa"/>
-              <w:bottom w:w="60" w:type="dxa"/>
-              <w:right w:w="100" w:type="dxa"/>
-            </w:tcMar>
-          </w:tcPr>
-          <w:p>
-            <w:r>
-              <w:rPr>
-                <w:b/>
-                <w:bCs/>
-                <w:color w:val="FFFFFF"/>
-                <w:sz w:val="20"/>
-                <w:szCs w:val="20"/>
-              </w:rPr>
-              <w:t>Влияние</w:t>
-            </w:r>
-          </w:p>
-        </w:tc>
-        <w:tc>
-          <w:tcPr>
-            <w:tcW w:w="4026" w:type="dxa"/>
-            <w:tcBorders>
-              <w:top w:val="single" w:sz="1" w:space="0" w:color="CCCCCC"/>
-              <w:left w:val="single" w:sz="1" w:space="0" w:color="CCCCCC"/>
-              <w:bottom w:val="single" w:sz="1" w:space="0" w:color="CCCCCC"/>
-              <w:right w:val="single" w:sz="1" w:space="0" w:color="CCCCCC"/>
-            </w:tcBorders>
-            <w:shd w:val="clear" w:color="auto" w:fill="1565C0"/>
-            <w:tcMar>
-              <w:top w:w="60" w:type="dxa"/>
-              <w:left w:w="100" w:type="dxa"/>
-              <w:bottom w:w="60" w:type="dxa"/>
-              <w:right w:w="100" w:type="dxa"/>
-            </w:tcMar>
-          </w:tcPr>
-          <w:p>
-            <w:r>
-              <w:rPr>
-                <w:b/>
-                <w:bCs/>
-                <w:color w:val="FFFFFF"/>
-                <w:sz w:val="20"/>
-                <w:szCs w:val="20"/>
-              </w:rPr>
-              <w:t>Мера снижения</w:t>
-            </w:r>
-          </w:p>
-        </w:tc>
-      </w:tr>
-      <w:tr>
-        <w:tblPrEx>
-          <w:tblCellMar>
-            <w:top w:w="0" w:type="dxa"/>
-            <w:bottom w:w="0" w:type="dxa"/>
-          </w:tblCellMar>
-        </w:tblPrEx>
-        <w:tc>
-          <w:tcPr>
-            <w:tcW w:w="2800" w:type="dxa"/>
-            <w:tcBorders>
-              <w:top w:val="single" w:sz="1" w:space="0" w:color="CCCCCC"/>
-              <w:left w:val="single" w:sz="1" w:space="0" w:color="CCCCCC"/>
-              <w:bottom w:val="single" w:sz="1" w:space="0" w:color="CCCCCC"/>
-              <w:right w:val="single" w:sz="1" w:space="0" w:color="CCCCCC"/>
-            </w:tcBorders>
-            <w:tcMar>
-              <w:top w:w="60" w:type="dxa"/>
-              <w:left w:w="100" w:type="dxa"/>
-              <w:bottom w:w="60" w:type="dxa"/>
-              <w:right w:w="100" w:type="dxa"/>
-            </w:tcMar>
-          </w:tcPr>
-          <w:p>
-            <w:r>
-              <w:rPr>
-                <w:sz w:val="20"/>
-                <w:szCs w:val="20"/>
-              </w:rPr>
-              <w:t>SCADA с пропусками</w:t>
-            </w:r>
-          </w:p>
-        </w:tc>
-        <w:tc>
-          <w:tcPr>
-            <w:tcW w:w="1100" w:type="dxa"/>
-            <w:tcBorders>
-              <w:top w:val="single" w:sz="1" w:space="0" w:color="CCCCCC"/>
-              <w:left w:val="single" w:sz="1" w:space="0" w:color="CCCCCC"/>
-              <w:bottom w:val="single" w:sz="1" w:space="0" w:color="CCCCCC"/>
-              <w:right w:val="single" w:sz="1" w:space="0" w:color="CCCCCC"/>
-            </w:tcBorders>
-            <w:tcMar>
-              <w:top w:w="60" w:type="dxa"/>
-              <w:left w:w="100" w:type="dxa"/>
-              <w:bottom w:w="60" w:type="dxa"/>
-              <w:right w:w="100" w:type="dxa"/>
-            </w:tcMar>
-          </w:tcPr>
-          <w:p>
-            <w:r>
-              <w:rPr>
-                <w:sz w:val="20"/>
-                <w:szCs w:val="20"/>
-              </w:rPr>
-              <w:t>Высокая</w:t>
-            </w:r>
-          </w:p>
-        </w:tc>
-        <w:tc>
-          <w:tcPr>
-            <w:tcW w:w="1100" w:type="dxa"/>
-            <w:tcBorders>
-              <w:top w:val="single" w:sz="1" w:space="0" w:color="CCCCCC"/>
-              <w:left w:val="single" w:sz="1" w:space="0" w:color="CCCCCC"/>
-              <w:bottom w:val="single" w:sz="1" w:space="0" w:color="CCCCCC"/>
-              <w:right w:val="single" w:sz="1" w:space="0" w:color="CCCCCC"/>
-            </w:tcBorders>
-            <w:tcMar>
-              <w:top w:w="60" w:type="dxa"/>
-              <w:left w:w="100" w:type="dxa"/>
-              <w:bottom w:w="60" w:type="dxa"/>
-              <w:right w:w="100" w:type="dxa"/>
-            </w:tcMar>
-          </w:tcPr>
-          <w:p>
-            <w:r>
-              <w:rPr>
-                <w:sz w:val="20"/>
-                <w:szCs w:val="20"/>
-              </w:rPr>
-              <w:t>Среднее</w:t>
-            </w:r>
-          </w:p>
-        </w:tc>
-        <w:tc>
-          <w:tcPr>
-            <w:tcW w:w="4026" w:type="dxa"/>
-            <w:tcBorders>
-              <w:top w:val="single" w:sz="1" w:space="0" w:color="CCCCCC"/>
-              <w:left w:val="single" w:sz="1" w:space="0" w:color="CCCCCC"/>
-              <w:bottom w:val="single" w:sz="1" w:space="0" w:color="CCCCCC"/>
-              <w:right w:val="single" w:sz="1" w:space="0" w:color="CCCCCC"/>
-            </w:tcBorders>
-            <w:tcMar>
-              <w:top w:w="60" w:type="dxa"/>
-              <w:left w:w="100" w:type="dxa"/>
-              <w:bottom w:w="60" w:type="dxa"/>
-              <w:right w:w="100" w:type="dxa"/>
-            </w:tcMar>
-          </w:tcPr>
-          <w:p>
-            <w:r>
-              <w:rPr>
-                <w:sz w:val="20"/>
-                <w:szCs w:val="20"/>
-              </w:rPr>
-              <w:t xml:space="preserve">Data Quality слой, </w:t>
-            </w:r>
-            <w:proofErr w:type="spellStart"/>
-            <w:r>
-              <w:rPr>
-                <w:sz w:val="20"/>
-                <w:szCs w:val="20"/>
-              </w:rPr>
-              <w:t>автофильтрация</w:t>
-            </w:r>
-            <w:proofErr w:type="spellEnd"/>
-          </w:p>
-        </w:tc>
-      </w:tr>
-      <w:tr>
-        <w:tblPrEx>
-          <w:tblCellMar>
-            <w:top w:w="0" w:type="dxa"/>
-            <w:bottom w:w="0" w:type="dxa"/>
-          </w:tblCellMar>
-        </w:tblPrEx>
-        <w:tc>
-          <w:tcPr>
-            <w:tcW w:w="2800" w:type="dxa"/>
-            <w:tcBorders>
-              <w:top w:val="single" w:sz="1" w:space="0" w:color="CCCCCC"/>
-              <w:left w:val="single" w:sz="1" w:space="0" w:color="CCCCCC"/>
-              <w:bottom w:val="single" w:sz="1" w:space="0" w:color="CCCCCC"/>
-              <w:right w:val="single" w:sz="1" w:space="0" w:color="CCCCCC"/>
-            </w:tcBorders>
-            <w:shd w:val="clear" w:color="auto" w:fill="F5F5F5"/>
-            <w:tcMar>
-              <w:top w:w="60" w:type="dxa"/>
-              <w:left w:w="100" w:type="dxa"/>
-              <w:bottom w:w="60" w:type="dxa"/>
-              <w:right w:w="100" w:type="dxa"/>
-            </w:tcMar>
-          </w:tcPr>
-          <w:p>
-            <w:r>
-              <w:rPr>
-                <w:sz w:val="20"/>
-                <w:szCs w:val="20"/>
-              </w:rPr>
-              <w:t>Структурный сдвиг (шайбы)</w:t>
-            </w:r>
-          </w:p>
-        </w:tc>
-        <w:tc>
-          <w:tcPr>
-            <w:tcW w:w="1100" w:type="dxa"/>
-            <w:tcBorders>
-              <w:top w:val="single" w:sz="1" w:space="0" w:color="CCCCCC"/>
-              <w:left w:val="single" w:sz="1" w:space="0" w:color="CCCCCC"/>
-              <w:bottom w:val="single" w:sz="1" w:space="0" w:color="CCCCCC"/>
-              <w:right w:val="single" w:sz="1" w:space="0" w:color="CCCCCC"/>
-            </w:tcBorders>
-            <w:shd w:val="clear" w:color="auto" w:fill="F5F5F5"/>
-            <w:tcMar>
-              <w:top w:w="60" w:type="dxa"/>
-              <w:left w:w="100" w:type="dxa"/>
-              <w:bottom w:w="60" w:type="dxa"/>
-              <w:right w:w="100" w:type="dxa"/>
-            </w:tcMar>
-          </w:tcPr>
-          <w:p>
-            <w:r>
-              <w:rPr>
-                <w:sz w:val="20"/>
-                <w:szCs w:val="20"/>
-              </w:rPr>
-              <w:t>Высокая</w:t>
-            </w:r>
-          </w:p>
-        </w:tc>
-        <w:tc>
-          <w:tcPr>
-            <w:tcW w:w="1100" w:type="dxa"/>
-            <w:tcBorders>
-              <w:top w:val="single" w:sz="1" w:space="0" w:color="CCCCCC"/>
-              <w:left w:val="single" w:sz="1" w:space="0" w:color="CCCCCC"/>
-              <w:bottom w:val="single" w:sz="1" w:space="0" w:color="CCCCCC"/>
-              <w:right w:val="single" w:sz="1" w:space="0" w:color="CCCCCC"/>
-            </w:tcBorders>
-            <w:shd w:val="clear" w:color="auto" w:fill="F5F5F5"/>
-            <w:tcMar>
-              <w:top w:w="60" w:type="dxa"/>
-              <w:left w:w="100" w:type="dxa"/>
-              <w:bottom w:w="60" w:type="dxa"/>
-              <w:right w:w="100" w:type="dxa"/>
-            </w:tcMar>
-          </w:tcPr>
-          <w:p>
-            <w:r>
-              <w:rPr>
-                <w:sz w:val="20"/>
-                <w:szCs w:val="20"/>
-              </w:rPr>
-              <w:t>Высокое</w:t>
-            </w:r>
-          </w:p>
-        </w:tc>
-        <w:tc>
-          <w:tcPr>
-            <w:tcW w:w="4026" w:type="dxa"/>
-            <w:tcBorders>
-              <w:top w:val="single" w:sz="1" w:space="0" w:color="CCCCCC"/>
-              <w:left w:val="single" w:sz="1" w:space="0" w:color="CCCCCC"/>
-              <w:bottom w:val="single" w:sz="1" w:space="0" w:color="CCCCCC"/>
-              <w:right w:val="single" w:sz="1" w:space="0" w:color="CCCCCC"/>
-            </w:tcBorders>
-            <w:shd w:val="clear" w:color="auto" w:fill="F5F5F5"/>
-            <w:tcMar>
-              <w:top w:w="60" w:type="dxa"/>
-              <w:left w:w="100" w:type="dxa"/>
-              <w:bottom w:w="60" w:type="dxa"/>
-              <w:right w:w="100" w:type="dxa"/>
-            </w:tcMar>
-          </w:tcPr>
-          <w:p>
-            <w:pPr>
-              <w:rPr>
-                <w:lang w:val="en-US"/>
-              </w:rPr>
-            </w:pPr>
-            <w:r>
-              <w:rPr>
-                <w:sz w:val="20"/>
-                <w:szCs w:val="20"/>
-                <w:lang w:val="en-US"/>
-              </w:rPr>
-              <w:t xml:space="preserve">Change-point detection, </w:t>
-            </w:r>
-            <w:r>
-              <w:rPr>
-                <w:sz w:val="20"/>
-                <w:szCs w:val="20"/>
-              </w:rPr>
-              <w:t>обучение</w:t>
-            </w:r>
-            <w:r>
-              <w:rPr>
-                <w:sz w:val="20"/>
-                <w:szCs w:val="20"/>
-                <w:lang w:val="en-US"/>
-              </w:rPr>
-              <w:t xml:space="preserve"> </w:t>
-            </w:r>
-            <w:r>
-              <w:rPr>
-                <w:sz w:val="20"/>
-                <w:szCs w:val="20"/>
-              </w:rPr>
-              <w:t>после</w:t>
-            </w:r>
-            <w:r>
-              <w:rPr>
-                <w:sz w:val="20"/>
-                <w:szCs w:val="20"/>
-                <w:lang w:val="en-US"/>
-              </w:rPr>
-              <w:t xml:space="preserve"> </w:t>
-            </w:r>
-            <w:r>
-              <w:rPr>
-                <w:sz w:val="20"/>
-                <w:szCs w:val="20"/>
-              </w:rPr>
-              <w:t>сдвига</w:t>
-            </w:r>
-          </w:p>
-        </w:tc>
-      </w:tr>
-      <w:tr>
-        <w:tblPrEx>
-          <w:tblCellMar>
-            <w:top w:w="0" w:type="dxa"/>
-            <w:bottom w:w="0" w:type="dxa"/>
-          </w:tblCellMar>
-        </w:tblPrEx>
-        <w:tc>
-          <w:tcPr>
-            <w:tcW w:w="2800" w:type="dxa"/>
-            <w:tcBorders>
-              <w:top w:val="single" w:sz="1" w:space="0" w:color="CCCCCC"/>
-              <w:left w:val="single" w:sz="1" w:space="0" w:color="CCCCCC"/>
-              <w:bottom w:val="single" w:sz="1" w:space="0" w:color="CCCCCC"/>
-              <w:right w:val="single" w:sz="1" w:space="0" w:color="CCCCCC"/>
-            </w:tcBorders>
-            <w:tcMar>
-              <w:top w:w="60" w:type="dxa"/>
-              <w:left w:w="100" w:type="dxa"/>
-              <w:bottom w:w="60" w:type="dxa"/>
-              <w:right w:w="100" w:type="dxa"/>
-            </w:tcMar>
-          </w:tcPr>
-          <w:p>
-            <w:r>
-              <w:rPr>
-                <w:sz w:val="20"/>
-                <w:szCs w:val="20"/>
-              </w:rPr>
-              <w:t>Оператор не доверяет</w:t>
-            </w:r>
-          </w:p>
-        </w:tc>
-        <w:tc>
-          <w:tcPr>
-            <w:tcW w:w="1100" w:type="dxa"/>
-            <w:tcBorders>
-              <w:top w:val="single" w:sz="1" w:space="0" w:color="CCCCCC"/>
-              <w:left w:val="single" w:sz="1" w:space="0" w:color="CCCCCC"/>
-              <w:bottom w:val="single" w:sz="1" w:space="0" w:color="CCCCCC"/>
-              <w:right w:val="single" w:sz="1" w:space="0" w:color="CCCCCC"/>
-            </w:tcBorders>
-            <w:tcMar>
-              <w:top w:w="60" w:type="dxa"/>
-              <w:left w:w="100" w:type="dxa"/>
-              <w:bottom w:w="60" w:type="dxa"/>
-              <w:right w:w="100" w:type="dxa"/>
-            </w:tcMar>
-          </w:tcPr>
-          <w:p>
-            <w:r>
-              <w:rPr>
-                <w:sz w:val="20"/>
-                <w:szCs w:val="20"/>
-              </w:rPr>
-              <w:t>Средняя</w:t>
-            </w:r>
-          </w:p>
-        </w:tc>
-        <w:tc>
-          <w:tcPr>
-            <w:tcW w:w="1100" w:type="dxa"/>
-            <w:tcBorders>
-              <w:top w:val="single" w:sz="1" w:space="0" w:color="CCCCCC"/>
-              <w:left w:val="single" w:sz="1" w:space="0" w:color="CCCCCC"/>
-              <w:bottom w:val="single" w:sz="1" w:space="0" w:color="CCCCCC"/>
-              <w:right w:val="single" w:sz="1" w:space="0" w:color="CCCCCC"/>
-            </w:tcBorders>
-            <w:tcMar>
-              <w:top w:w="60" w:type="dxa"/>
-              <w:left w:w="100" w:type="dxa"/>
-              <w:bottom w:w="60" w:type="dxa"/>
-              <w:right w:w="100" w:type="dxa"/>
-            </w:tcMar>
-          </w:tcPr>
-          <w:p>
-            <w:r>
-              <w:rPr>
-                <w:sz w:val="20"/>
-                <w:szCs w:val="20"/>
-              </w:rPr>
-              <w:t>Высокое</w:t>
-            </w:r>
-          </w:p>
-        </w:tc>
-        <w:tc>
-          <w:tcPr>
-            <w:tcW w:w="4026" w:type="dxa"/>
-            <w:tcBorders>
-              <w:top w:val="single" w:sz="1" w:space="0" w:color="CCCCCC"/>
-              <w:left w:val="single" w:sz="1" w:space="0" w:color="CCCCCC"/>
-              <w:bottom w:val="single" w:sz="1" w:space="0" w:color="CCCCCC"/>
-              <w:right w:val="single" w:sz="1" w:space="0" w:color="CCCCCC"/>
-            </w:tcBorders>
-            <w:tcMar>
-              <w:top w:w="60" w:type="dxa"/>
-              <w:left w:w="100" w:type="dxa"/>
-              <w:bottom w:w="60" w:type="dxa"/>
-              <w:right w:w="100" w:type="dxa"/>
-            </w:tcMar>
-          </w:tcPr>
-          <w:p>
-            <w:r>
-              <w:rPr>
-                <w:sz w:val="20"/>
-                <w:szCs w:val="20"/>
-              </w:rPr>
-              <w:t>Совместное тестирование, простой UI</w:t>
-            </w:r>
-          </w:p>
-        </w:tc>
-      </w:tr>
-      <w:tr>
-        <w:tblPrEx>
-          <w:tblCellMar>
-            <w:top w:w="0" w:type="dxa"/>
-            <w:bottom w:w="0" w:type="dxa"/>
-          </w:tblCellMar>
-        </w:tblPrEx>
-        <w:tc>
-          <w:tcPr>
-            <w:tcW w:w="2800" w:type="dxa"/>
-            <w:tcBorders>
-              <w:top w:val="single" w:sz="1" w:space="0" w:color="CCCCCC"/>
-              <w:left w:val="single" w:sz="1" w:space="0" w:color="CCCCCC"/>
-              <w:bottom w:val="single" w:sz="1" w:space="0" w:color="CCCCCC"/>
-              <w:right w:val="single" w:sz="1" w:space="0" w:color="CCCCCC"/>
-            </w:tcBorders>
-            <w:shd w:val="clear" w:color="auto" w:fill="F5F5F5"/>
-            <w:tcMar>
-              <w:top w:w="60" w:type="dxa"/>
-              <w:left w:w="100" w:type="dxa"/>
-              <w:bottom w:w="60" w:type="dxa"/>
-              <w:right w:w="100" w:type="dxa"/>
-            </w:tcMar>
-          </w:tcPr>
-          <w:p>
-            <w:r>
-              <w:rPr>
-                <w:sz w:val="20"/>
-                <w:szCs w:val="20"/>
-              </w:rPr>
-              <w:t>[Добавить]</w:t>
-            </w:r>
-          </w:p>
-        </w:tc>
-        <w:tc>
-          <w:tcPr>
-            <w:tcW w:w="1100" w:type="dxa"/>
-            <w:tcBorders>
-              <w:top w:val="single" w:sz="1" w:space="0" w:color="CCCCCC"/>
-              <w:left w:val="single" w:sz="1" w:space="0" w:color="CCCCCC"/>
-              <w:bottom w:val="single" w:sz="1" w:space="0" w:color="CCCCCC"/>
-              <w:right w:val="single" w:sz="1" w:space="0" w:color="CCCCCC"/>
-            </w:tcBorders>
-            <w:shd w:val="clear" w:color="auto" w:fill="F5F5F5"/>
-            <w:tcMar>
-              <w:top w:w="60" w:type="dxa"/>
-              <w:left w:w="100" w:type="dxa"/>
-              <w:bottom w:w="60" w:type="dxa"/>
-              <w:right w:w="100" w:type="dxa"/>
-            </w:tcMar>
-          </w:tcPr>
-          <w:p/>
-        </w:tc>
-        <w:tc>
-          <w:tcPr>
-            <w:tcW w:w="1100" w:type="dxa"/>
-            <w:tcBorders>
-              <w:top w:val="single" w:sz="1" w:space="0" w:color="CCCCCC"/>
-              <w:left w:val="single" w:sz="1" w:space="0" w:color="CCCCCC"/>
-              <w:bottom w:val="single" w:sz="1" w:space="0" w:color="CCCCCC"/>
-              <w:right w:val="single" w:sz="1" w:space="0" w:color="CCCCCC"/>
-            </w:tcBorders>
-            <w:shd w:val="clear" w:color="auto" w:fill="F5F5F5"/>
-            <w:tcMar>
-              <w:top w:w="60" w:type="dxa"/>
-              <w:left w:w="100" w:type="dxa"/>
-              <w:bottom w:w="60" w:type="dxa"/>
-              <w:right w:w="100" w:type="dxa"/>
-            </w:tcMar>
-          </w:tcPr>
-          <w:p/>
-        </w:tc>
-        <w:tc>
-          <w:tcPr>
-            <w:tcW w:w="4026" w:type="dxa"/>
-            <w:tcBorders>
-              <w:top w:val="single" w:sz="1" w:space="0" w:color="CCCCCC"/>
-              <w:left w:val="single" w:sz="1" w:space="0" w:color="CCCCCC"/>
-              <w:bottom w:val="single" w:sz="1" w:space="0" w:color="CCCCCC"/>
-              <w:right w:val="single" w:sz="1" w:space="0" w:color="CCCCCC"/>
-            </w:tcBorders>
-            <w:shd w:val="clear" w:color="auto" w:fill="F5F5F5"/>
-            <w:tcMar>
-              <w:top w:w="60" w:type="dxa"/>
-              <w:left w:w="100" w:type="dxa"/>
-              <w:bottom w:w="60" w:type="dxa"/>
-              <w:right w:w="100" w:type="dxa"/>
-            </w:tcMar>
-          </w:tcPr>
-          <w:p/>
-        </w:tc>
-      </w:tr>
-    </w:tbl>
+    <w:p>
+      <w:pPr>
+        <w:spacing w:before="100" w:beforeAutospacing="1" w:after="100" w:afterAutospacing="1"/>
+        <w:rPr>
+          <w:rFonts w:ascii="Times New Roman" w:eastAsia="Times New Roman" w:hAnsi="Times New Roman" w:cs="Times New Roman"/>
+          <w:sz w:val="24"/>
+          <w:szCs w:val="24"/>
+        </w:rPr>
+      </w:pPr>
+      <w:r>
+        <w:rPr>
+          <w:rFonts w:ascii="Times New Roman" w:eastAsia="Times New Roman" w:hAnsi="Times New Roman" w:cs="Times New Roman"/>
+          <w:b/>
+          <w:bCs/>
+          <w:sz w:val="24"/>
+          <w:szCs w:val="24"/>
+        </w:rPr>
+        <w:t>Допущения (</w:t>
+      </w:r>
+      <w:proofErr w:type="spellStart"/>
+      <w:r>
+        <w:rPr>
+          <w:rFonts w:ascii="Times New Roman" w:eastAsia="Times New Roman" w:hAnsi="Times New Roman" w:cs="Times New Roman"/>
+          <w:b/>
+          <w:bCs/>
+          <w:sz w:val="24"/>
+          <w:szCs w:val="24"/>
+        </w:rPr>
+        <w:t>testable</w:t>
+      </w:r>
+      <w:proofErr w:type="spellEnd"/>
+      <w:r>
+        <w:rPr>
+          <w:rFonts w:ascii="Times New Roman" w:eastAsia="Times New Roman" w:hAnsi="Times New Roman" w:cs="Times New Roman"/>
+          <w:b/>
+          <w:bCs/>
+          <w:sz w:val="24"/>
+          <w:szCs w:val="24"/>
+        </w:rPr>
+        <w:t>):</w:t>
+      </w:r>
+    </w:p>
+    <w:p>
+      <w:pPr>
+        <w:numPr>
+          <w:ilvl w:val="0"/>
+          <w:numId w:val="3"/>
+        </w:numPr>
+        <w:spacing w:before="100" w:beforeAutospacing="1" w:after="100" w:afterAutospacing="1"/>
+        <w:rPr>
+          <w:rFonts w:ascii="Times New Roman" w:eastAsia="Times New Roman" w:hAnsi="Times New Roman" w:cs="Times New Roman"/>
+          <w:sz w:val="24"/>
+          <w:szCs w:val="24"/>
+        </w:rPr>
+      </w:pPr>
+      <w:proofErr w:type="spellStart"/>
+      <w:r>
+        <w:rPr>
+          <w:rFonts w:ascii="Times New Roman" w:eastAsia="Times New Roman" w:hAnsi="Times New Roman" w:cs="Times New Roman"/>
+          <w:sz w:val="24"/>
+          <w:szCs w:val="24"/>
+        </w:rPr>
+        <w:t>T_ret_sec</w:t>
+      </w:r>
+      <w:proofErr w:type="spellEnd"/>
+      <w:r>
+        <w:rPr>
+          <w:rFonts w:ascii="Times New Roman" w:eastAsia="Times New Roman" w:hAnsi="Times New Roman" w:cs="Times New Roman"/>
+          <w:sz w:val="24"/>
+          <w:szCs w:val="24"/>
+        </w:rPr>
+        <w:t xml:space="preserve"> </w:t>
+      </w:r>
+      <w:proofErr w:type="gramStart"/>
+      <w:r>
+        <w:rPr>
+          <w:rFonts w:ascii="Times New Roman" w:eastAsia="Times New Roman" w:hAnsi="Times New Roman" w:cs="Times New Roman"/>
+          <w:sz w:val="24"/>
+          <w:szCs w:val="24"/>
+        </w:rPr>
+        <w:t xml:space="preserve">&lt; </w:t>
+      </w:r>
+      <w:proofErr w:type="spellStart"/>
+      <w:r>
+        <w:rPr>
+          <w:rFonts w:ascii="Times New Roman" w:eastAsia="Times New Roman" w:hAnsi="Times New Roman" w:cs="Times New Roman"/>
+          <w:sz w:val="24"/>
+          <w:szCs w:val="24"/>
+        </w:rPr>
+        <w:t>T</w:t>
+      </w:r>
+      <w:proofErr w:type="gramEnd"/>
+      <w:r>
+        <w:rPr>
+          <w:rFonts w:ascii="Times New Roman" w:eastAsia="Times New Roman" w:hAnsi="Times New Roman" w:cs="Times New Roman"/>
+          <w:sz w:val="24"/>
+          <w:szCs w:val="24"/>
+        </w:rPr>
+        <w:t>_sup_sec</w:t>
+      </w:r>
+      <w:proofErr w:type="spellEnd"/>
+      <w:r>
+        <w:rPr>
+          <w:rFonts w:ascii="Times New Roman" w:eastAsia="Times New Roman" w:hAnsi="Times New Roman" w:cs="Times New Roman"/>
+          <w:sz w:val="24"/>
+          <w:szCs w:val="24"/>
+        </w:rPr>
+        <w:t xml:space="preserve"> при работающей системе → проверить в EDA (задача 2.4)</w:t>
+      </w:r>
+    </w:p>
+    <w:p>
+      <w:pPr>
+        <w:numPr>
+          <w:ilvl w:val="0"/>
+          <w:numId w:val="3"/>
+        </w:numPr>
+        <w:spacing w:before="100" w:beforeAutospacing="1" w:after="100" w:afterAutospacing="1"/>
+        <w:rPr>
+          <w:rFonts w:ascii="Times New Roman" w:eastAsia="Times New Roman" w:hAnsi="Times New Roman" w:cs="Times New Roman"/>
+          <w:sz w:val="24"/>
+          <w:szCs w:val="24"/>
+        </w:rPr>
+      </w:pPr>
+      <w:r>
+        <w:rPr>
+          <w:rFonts w:ascii="Times New Roman" w:eastAsia="Times New Roman" w:hAnsi="Times New Roman" w:cs="Times New Roman"/>
+          <w:sz w:val="24"/>
+          <w:szCs w:val="24"/>
+        </w:rPr>
+        <w:t xml:space="preserve">Инерционность = 3–6ч → измерить </w:t>
+      </w:r>
+      <w:proofErr w:type="spellStart"/>
+      <w:r>
+        <w:rPr>
+          <w:rFonts w:ascii="Times New Roman" w:eastAsia="Times New Roman" w:hAnsi="Times New Roman" w:cs="Times New Roman"/>
+          <w:sz w:val="24"/>
+          <w:szCs w:val="24"/>
+        </w:rPr>
+        <w:t>cross-correlation</w:t>
+      </w:r>
+      <w:proofErr w:type="spellEnd"/>
+      <w:r>
+        <w:rPr>
+          <w:rFonts w:ascii="Times New Roman" w:eastAsia="Times New Roman" w:hAnsi="Times New Roman" w:cs="Times New Roman"/>
+          <w:sz w:val="24"/>
+          <w:szCs w:val="24"/>
+        </w:rPr>
+        <w:t xml:space="preserve"> (задача 2.3.7)</w:t>
+      </w:r>
+    </w:p>
+    <w:p>
+      <w:pPr>
+        <w:numPr>
+          <w:ilvl w:val="0"/>
+          <w:numId w:val="3"/>
+        </w:numPr>
+        <w:spacing w:before="100" w:beforeAutospacing="1" w:after="100" w:afterAutospacing="1"/>
+        <w:rPr>
+          <w:rFonts w:ascii="Times New Roman" w:eastAsia="Times New Roman" w:hAnsi="Times New Roman" w:cs="Times New Roman"/>
+          <w:sz w:val="24"/>
+          <w:szCs w:val="24"/>
+        </w:rPr>
+      </w:pPr>
+      <w:r>
+        <w:rPr>
+          <w:rFonts w:ascii="Times New Roman" w:eastAsia="Times New Roman" w:hAnsi="Times New Roman" w:cs="Times New Roman"/>
+          <w:sz w:val="24"/>
+          <w:szCs w:val="24"/>
+        </w:rPr>
+        <w:t>Суточная и недельная сезонность → ACF/PACF (задача 2.3.4)</w:t>
+      </w:r>
+    </w:p>
+    <w:p>
+      <w:pPr>
+        <w:numPr>
+          <w:ilvl w:val="0"/>
+          <w:numId w:val="3"/>
+        </w:numPr>
+        <w:spacing w:before="100" w:beforeAutospacing="1" w:after="100" w:afterAutospacing="1"/>
+        <w:rPr>
+          <w:rFonts w:ascii="Times New Roman" w:eastAsia="Times New Roman" w:hAnsi="Times New Roman" w:cs="Times New Roman"/>
+          <w:sz w:val="24"/>
+          <w:szCs w:val="24"/>
+          <w:lang w:val="en-US"/>
+        </w:rPr>
+      </w:pPr>
+      <w:r>
+        <w:rPr>
+          <w:rFonts w:ascii="Times New Roman" w:eastAsia="Times New Roman" w:hAnsi="Times New Roman" w:cs="Times New Roman"/>
+          <w:sz w:val="24"/>
+          <w:szCs w:val="24"/>
+          <w:lang w:val="en-US"/>
+        </w:rPr>
+        <w:t xml:space="preserve">LightGBM </w:t>
+      </w:r>
+      <w:r>
+        <w:rPr>
+          <w:rFonts w:ascii="Times New Roman" w:eastAsia="Times New Roman" w:hAnsi="Times New Roman" w:cs="Times New Roman"/>
+          <w:sz w:val="24"/>
+          <w:szCs w:val="24"/>
+        </w:rPr>
+        <w:t>бьёт</w:t>
+      </w:r>
+      <w:r>
+        <w:rPr>
+          <w:rFonts w:ascii="Times New Roman" w:eastAsia="Times New Roman" w:hAnsi="Times New Roman" w:cs="Times New Roman"/>
+          <w:sz w:val="24"/>
+          <w:szCs w:val="24"/>
+          <w:lang w:val="en-US"/>
+        </w:rPr>
+        <w:t xml:space="preserve"> ARIMA → DM-test (</w:t>
+      </w:r>
+      <w:r>
+        <w:rPr>
+          <w:rFonts w:ascii="Times New Roman" w:eastAsia="Times New Roman" w:hAnsi="Times New Roman" w:cs="Times New Roman"/>
+          <w:sz w:val="24"/>
+          <w:szCs w:val="24"/>
+        </w:rPr>
+        <w:t>задача</w:t>
+      </w:r>
+      <w:r>
+        <w:rPr>
+          <w:rFonts w:ascii="Times New Roman" w:eastAsia="Times New Roman" w:hAnsi="Times New Roman" w:cs="Times New Roman"/>
+          <w:sz w:val="24"/>
+          <w:szCs w:val="24"/>
+          <w:lang w:val="en-US"/>
+        </w:rPr>
+        <w:t xml:space="preserve"> 4.4)</w:t>
+      </w:r>
+    </w:p>
+    <w:p>
+      <w:pPr>
+        <w:spacing w:before="100" w:beforeAutospacing="1" w:after="100" w:afterAutospacing="1"/>
+        <w:rPr>
+          <w:rFonts w:ascii="Times New Roman" w:eastAsia="Times New Roman" w:hAnsi="Times New Roman" w:cs="Times New Roman"/>
+          <w:sz w:val="24"/>
+          <w:szCs w:val="24"/>
+        </w:rPr>
+      </w:pPr>
+      <w:r>
+        <w:rPr>
+          <w:rFonts w:ascii="Times New Roman" w:eastAsia="Times New Roman" w:hAnsi="Times New Roman" w:cs="Times New Roman"/>
+          <w:b/>
+          <w:bCs/>
+          <w:sz w:val="24"/>
+          <w:szCs w:val="24"/>
+        </w:rPr>
+        <w:t>Допущения (</w:t>
+      </w:r>
+      <w:proofErr w:type="spellStart"/>
+      <w:r>
+        <w:rPr>
+          <w:rFonts w:ascii="Times New Roman" w:eastAsia="Times New Roman" w:hAnsi="Times New Roman" w:cs="Times New Roman"/>
+          <w:b/>
+          <w:bCs/>
+          <w:sz w:val="24"/>
+          <w:szCs w:val="24"/>
+        </w:rPr>
+        <w:t>untestable</w:t>
+      </w:r>
+      <w:proofErr w:type="spellEnd"/>
+      <w:r>
+        <w:rPr>
+          <w:rFonts w:ascii="Times New Roman" w:eastAsia="Times New Roman" w:hAnsi="Times New Roman" w:cs="Times New Roman"/>
+          <w:b/>
+          <w:bCs/>
+          <w:sz w:val="24"/>
+          <w:szCs w:val="24"/>
+        </w:rPr>
+        <w:t>, записываем как ограничения):</w:t>
+      </w:r>
+    </w:p>
+    <w:p>
+      <w:pPr>
+        <w:numPr>
+          <w:ilvl w:val="0"/>
+          <w:numId w:val="4"/>
+        </w:numPr>
+        <w:spacing w:before="100" w:beforeAutospacing="1" w:after="100" w:afterAutospacing="1"/>
+        <w:rPr>
+          <w:rFonts w:ascii="Times New Roman" w:eastAsia="Times New Roman" w:hAnsi="Times New Roman" w:cs="Times New Roman"/>
+          <w:sz w:val="24"/>
+          <w:szCs w:val="24"/>
+        </w:rPr>
+      </w:pPr>
+      <w:r>
+        <w:rPr>
+          <w:rFonts w:ascii="Times New Roman" w:eastAsia="Times New Roman" w:hAnsi="Times New Roman" w:cs="Times New Roman"/>
+          <w:sz w:val="24"/>
+          <w:szCs w:val="24"/>
+        </w:rPr>
+        <w:t xml:space="preserve">Экономия 5–15% подтверждена </w:t>
+      </w:r>
+      <w:proofErr w:type="spellStart"/>
+      <w:r>
+        <w:rPr>
+          <w:rFonts w:ascii="Times New Roman" w:eastAsia="Times New Roman" w:hAnsi="Times New Roman" w:cs="Times New Roman"/>
+          <w:sz w:val="24"/>
+          <w:szCs w:val="24"/>
+        </w:rPr>
+        <w:t>Нетбаем</w:t>
+      </w:r>
+      <w:proofErr w:type="spellEnd"/>
+      <w:r>
+        <w:rPr>
+          <w:rFonts w:ascii="Times New Roman" w:eastAsia="Times New Roman" w:hAnsi="Times New Roman" w:cs="Times New Roman"/>
+          <w:sz w:val="24"/>
+          <w:szCs w:val="24"/>
+        </w:rPr>
+        <w:t xml:space="preserve"> для г. Лысьва; для Ниша и ПЗ — допущение</w:t>
+      </w:r>
+    </w:p>
+    <w:p>
+      <w:pPr>
+        <w:numPr>
+          <w:ilvl w:val="0"/>
+          <w:numId w:val="4"/>
+        </w:numPr>
+        <w:spacing w:before="100" w:beforeAutospacing="1" w:after="100" w:afterAutospacing="1"/>
+        <w:rPr>
+          <w:rFonts w:ascii="Times New Roman" w:eastAsia="Times New Roman" w:hAnsi="Times New Roman" w:cs="Times New Roman"/>
+          <w:sz w:val="24"/>
+          <w:szCs w:val="24"/>
+        </w:rPr>
+      </w:pPr>
+      <w:r>
+        <w:rPr>
+          <w:rFonts w:ascii="Times New Roman" w:eastAsia="Times New Roman" w:hAnsi="Times New Roman" w:cs="Times New Roman"/>
+          <w:sz w:val="24"/>
+          <w:szCs w:val="24"/>
+        </w:rPr>
+        <w:t>Оператор будет доверять рекомендациям ML</w:t>
+      </w:r>
+    </w:p>
+    <w:p>
+      <w:pPr>
+        <w:numPr>
+          <w:ilvl w:val="0"/>
+          <w:numId w:val="4"/>
+        </w:numPr>
+        <w:spacing w:before="100" w:beforeAutospacing="1" w:after="100" w:afterAutospacing="1"/>
+        <w:rPr>
+          <w:rFonts w:ascii="Times New Roman" w:eastAsia="Times New Roman" w:hAnsi="Times New Roman" w:cs="Times New Roman"/>
+          <w:sz w:val="24"/>
+          <w:szCs w:val="24"/>
+        </w:rPr>
+      </w:pPr>
+      <w:r>
+        <w:rPr>
+          <w:rFonts w:ascii="Times New Roman" w:eastAsia="Times New Roman" w:hAnsi="Times New Roman" w:cs="Times New Roman"/>
+          <w:sz w:val="24"/>
+          <w:szCs w:val="24"/>
+        </w:rPr>
+        <w:t xml:space="preserve">Данные Ниша достаточно репрезентативны для </w:t>
+      </w:r>
+      <w:proofErr w:type="spellStart"/>
+      <w:r>
+        <w:rPr>
+          <w:rFonts w:ascii="Times New Roman" w:eastAsia="Times New Roman" w:hAnsi="Times New Roman" w:cs="Times New Roman"/>
+          <w:sz w:val="24"/>
+          <w:szCs w:val="24"/>
+        </w:rPr>
+        <w:t>proof-of-concept</w:t>
+      </w:r>
+      <w:proofErr w:type="spellEnd"/>
+    </w:p>
+    <w:p>
+      <w:pPr>
+        <w:spacing w:before="100" w:beforeAutospacing="1" w:after="100" w:afterAutospacing="1"/>
+        <w:rPr>
+          <w:rFonts w:ascii="Times New Roman" w:eastAsia="Times New Roman" w:hAnsi="Times New Roman" w:cs="Times New Roman"/>
+          <w:sz w:val="24"/>
+          <w:szCs w:val="24"/>
+        </w:rPr>
+      </w:pPr>
+      <w:r>
+        <w:rPr>
+          <w:rFonts w:ascii="Times New Roman" w:eastAsia="Times New Roman" w:hAnsi="Times New Roman" w:cs="Times New Roman"/>
+          <w:b/>
+          <w:bCs/>
+          <w:sz w:val="24"/>
+          <w:szCs w:val="24"/>
+        </w:rPr>
+        <w:t>Ограничения (</w:t>
+      </w:r>
+      <w:proofErr w:type="spellStart"/>
+      <w:r>
+        <w:rPr>
+          <w:rFonts w:ascii="Times New Roman" w:eastAsia="Times New Roman" w:hAnsi="Times New Roman" w:cs="Times New Roman"/>
+          <w:b/>
+          <w:bCs/>
+          <w:sz w:val="24"/>
+          <w:szCs w:val="24"/>
+        </w:rPr>
+        <w:t>constraints</w:t>
+      </w:r>
+      <w:proofErr w:type="spellEnd"/>
+      <w:r>
+        <w:rPr>
+          <w:rFonts w:ascii="Times New Roman" w:eastAsia="Times New Roman" w:hAnsi="Times New Roman" w:cs="Times New Roman"/>
+          <w:b/>
+          <w:bCs/>
+          <w:sz w:val="24"/>
+          <w:szCs w:val="24"/>
+        </w:rPr>
+        <w:t>):</w:t>
+      </w:r>
+    </w:p>
+    <w:p>
+      <w:pPr>
+        <w:numPr>
+          <w:ilvl w:val="0"/>
+          <w:numId w:val="5"/>
+        </w:numPr>
+        <w:spacing w:before="100" w:beforeAutospacing="1" w:after="100" w:afterAutospacing="1"/>
+        <w:rPr>
+          <w:rFonts w:ascii="Times New Roman" w:eastAsia="Times New Roman" w:hAnsi="Times New Roman" w:cs="Times New Roman"/>
+          <w:sz w:val="24"/>
+          <w:szCs w:val="24"/>
+        </w:rPr>
+      </w:pPr>
+      <w:r>
+        <w:rPr>
+          <w:rFonts w:ascii="Times New Roman" w:eastAsia="Times New Roman" w:hAnsi="Times New Roman" w:cs="Times New Roman"/>
+          <w:sz w:val="24"/>
+          <w:szCs w:val="24"/>
+        </w:rPr>
+        <w:t xml:space="preserve">CC BY-NC лицензия, нет прогноза погоды, нет расхода, нет </w:t>
+      </w:r>
+      <w:proofErr w:type="spellStart"/>
+      <w:r>
+        <w:rPr>
+          <w:rFonts w:ascii="Times New Roman" w:eastAsia="Times New Roman" w:hAnsi="Times New Roman" w:cs="Times New Roman"/>
+          <w:sz w:val="24"/>
+          <w:szCs w:val="24"/>
+        </w:rPr>
+        <w:t>real-time</w:t>
+      </w:r>
+      <w:proofErr w:type="spellEnd"/>
+      <w:r>
+        <w:rPr>
+          <w:rFonts w:ascii="Times New Roman" w:eastAsia="Times New Roman" w:hAnsi="Times New Roman" w:cs="Times New Roman"/>
+          <w:sz w:val="24"/>
+          <w:szCs w:val="24"/>
+        </w:rPr>
+        <w:t>, один город</w:t>
+      </w:r>
+    </w:p>
     <w:p>
       <w:r>
         <w:br w:type="page"/>
@@ -14582,6 +14394,119 @@
 <file path=word/numbering.xml><?xml version="1.0" encoding="utf-8"?>
 <w:numbering xmlns:wpc="http://schemas.microsoft.com/office/word/2010/wordprocessingCanvas" xmlns:cx="http://schemas.microsoft.com/office/drawing/2014/chartex" xmlns:cx1="http://schemas.microsoft.com/office/drawing/2015/9/8/chartex" xmlns:cx2="http://schemas.microsoft.com/office/drawing/2015/10/21/chartex" xmlns:cx3="http://schemas.microsoft.com/office/drawing/2016/5/9/chartex" xmlns:cx4="http://schemas.microsoft.com/office/drawing/2016/5/10/chartex" xmlns:cx5="http://schemas.microsoft.com/office/drawing/2016/5/11/chartex" xmlns:cx6="http://schemas.microsoft.com/office/drawing/2016/5/12/chartex" xmlns:cx7="http://schemas.microsoft.com/office/drawing/2016/5/13/chartex" xmlns:cx8="http://schemas.microsoft.com/office/drawing/2016/5/14/chartex" xmlns:mc="http://schemas.openxmlformats.org/markup-compatibility/2006" xmlns:aink="http://schemas.microsoft.com/office/drawing/2016/ink" xmlns:am3d="http://schemas.microsoft.com/office/drawing/2017/model3d" xmlns:o="urn:schemas-microsoft-com:office:office" xmlns:r="http://schemas.openxmlformats.org/officeDocument/2006/relationships" xmlns:m="http://schemas.openxmlformats.org/officeDocument/2006/math" xmlns:v="urn:schemas-microsoft-com:vml" xmlns:wp14="http://schemas.microsoft.com/office/word/2010/wordprocessingDrawing" xmlns:wp="http://schemas.openxmlformats.org/drawingml/2006/wordprocessingDrawing" xmlns:w10="urn:schemas-microsoft-com:office:word" xmlns:w="http://schemas.openxmlformats.org/wordprocessingml/2006/main" xmlns:w14="http://schemas.microsoft.com/office/word/2010/wordml" xmlns:w15="http://schemas.microsoft.com/office/word/2012/wordml" xmlns:w16cex="http://schemas.microsoft.com/office/word/2018/wordml/cex" xmlns:w16cid="http://schemas.microsoft.com/office/word/2016/wordml/cid" xmlns:w16="http://schemas.microsoft.com/office/word/2018/wordml" xmlns:w16sdtdh="http://schemas.microsoft.com/office/word/2020/wordml/sdtdatahash" xmlns:w16se="http://schemas.microsoft.com/office/word/2015/wordml/symex" xmlns:wpg="http://schemas.microsoft.com/office/word/2010/wordprocessingGroup" xmlns:wpi="http://schemas.microsoft.com/office/word/2010/wordprocessingInk" xmlns:wne="http://schemas.microsoft.com/office/word/2006/wordml" xmlns:wps="http://schemas.microsoft.com/office/word/2010/wordprocessingShape" mc:Ignorable="w14 w15 w16se w16cid w16 w16cex w16sdtdh wp14">
   <w:abstractNum w:abstractNumId="0" w15:restartNumberingAfterBreak="0">
+    <w:nsid w:val="01E30C85"/>
+    <w:multiLevelType w:val="multilevel"/>
+    <w:tmpl w:val="17E4FD14"/>
+    <w:lvl w:ilvl="0">
+      <w:start w:val="1"/>
+      <w:numFmt w:val="decimal"/>
+      <w:lvlText w:val="%1."/>
+      <w:lvlJc w:val="left"/>
+      <w:pPr>
+        <w:tabs>
+          <w:tab w:val="num" w:pos="720"/>
+        </w:tabs>
+        <w:ind w:left="720" w:hanging="360"/>
+      </w:pPr>
+    </w:lvl>
+    <w:lvl w:ilvl="1" w:tentative="1">
+      <w:start w:val="1"/>
+      <w:numFmt w:val="decimal"/>
+      <w:lvlText w:val="%2."/>
+      <w:lvlJc w:val="left"/>
+      <w:pPr>
+        <w:tabs>
+          <w:tab w:val="num" w:pos="1440"/>
+        </w:tabs>
+        <w:ind w:left="1440" w:hanging="360"/>
+      </w:pPr>
+    </w:lvl>
+    <w:lvl w:ilvl="2" w:tentative="1">
+      <w:start w:val="1"/>
+      <w:numFmt w:val="decimal"/>
+      <w:lvlText w:val="%3."/>
+      <w:lvlJc w:val="left"/>
+      <w:pPr>
+        <w:tabs>
+          <w:tab w:val="num" w:pos="2160"/>
+        </w:tabs>
+        <w:ind w:left="2160" w:hanging="360"/>
+      </w:pPr>
+    </w:lvl>
+    <w:lvl w:ilvl="3" w:tentative="1">
+      <w:start w:val="1"/>
+      <w:numFmt w:val="decimal"/>
+      <w:lvlText w:val="%4."/>
+      <w:lvlJc w:val="left"/>
+      <w:pPr>
+        <w:tabs>
+          <w:tab w:val="num" w:pos="2880"/>
+        </w:tabs>
+        <w:ind w:left="2880" w:hanging="360"/>
+      </w:pPr>
+    </w:lvl>
+    <w:lvl w:ilvl="4" w:tentative="1">
+      <w:start w:val="1"/>
+      <w:numFmt w:val="decimal"/>
+      <w:lvlText w:val="%5."/>
+      <w:lvlJc w:val="left"/>
+      <w:pPr>
+        <w:tabs>
+          <w:tab w:val="num" w:pos="3600"/>
+        </w:tabs>
+        <w:ind w:left="3600" w:hanging="360"/>
+      </w:pPr>
+    </w:lvl>
+    <w:lvl w:ilvl="5" w:tentative="1">
+      <w:start w:val="1"/>
+      <w:numFmt w:val="decimal"/>
+      <w:lvlText w:val="%6."/>
+      <w:lvlJc w:val="left"/>
+      <w:pPr>
+        <w:tabs>
+          <w:tab w:val="num" w:pos="4320"/>
+        </w:tabs>
+        <w:ind w:left="4320" w:hanging="360"/>
+      </w:pPr>
+    </w:lvl>
+    <w:lvl w:ilvl="6" w:tentative="1">
+      <w:start w:val="1"/>
+      <w:numFmt w:val="decimal"/>
+      <w:lvlText w:val="%7."/>
+      <w:lvlJc w:val="left"/>
+      <w:pPr>
+        <w:tabs>
+          <w:tab w:val="num" w:pos="5040"/>
+        </w:tabs>
+        <w:ind w:left="5040" w:hanging="360"/>
+      </w:pPr>
+    </w:lvl>
+    <w:lvl w:ilvl="7" w:tentative="1">
+      <w:start w:val="1"/>
+      <w:numFmt w:val="decimal"/>
+      <w:lvlText w:val="%8."/>
+      <w:lvlJc w:val="left"/>
+      <w:pPr>
+        <w:tabs>
+          <w:tab w:val="num" w:pos="5760"/>
+        </w:tabs>
+        <w:ind w:left="5760" w:hanging="360"/>
+      </w:pPr>
+    </w:lvl>
+    <w:lvl w:ilvl="8" w:tentative="1">
+      <w:start w:val="1"/>
+      <w:numFmt w:val="decimal"/>
+      <w:lvlText w:val="%9."/>
+      <w:lvlJc w:val="left"/>
+      <w:pPr>
+        <w:tabs>
+          <w:tab w:val="num" w:pos="6480"/>
+        </w:tabs>
+        <w:ind w:left="6480" w:hanging="360"/>
+      </w:pPr>
+    </w:lvl>
+  </w:abstractNum>
+  <w:abstractNum w:abstractNumId="1" w15:restartNumberingAfterBreak="0">
     <w:nsid w:val="025B1C9A"/>
     <w:multiLevelType w:val="multilevel"/>
     <w:tmpl w:val="02A49808"/>
@@ -14730,7 +14655,7 @@
       </w:rPr>
     </w:lvl>
   </w:abstractNum>
-  <w:abstractNum w:abstractNumId="1" w15:restartNumberingAfterBreak="0">
+  <w:abstractNum w:abstractNumId="2" w15:restartNumberingAfterBreak="0">
     <w:nsid w:val="438766B4"/>
     <w:multiLevelType w:val="hybridMultilevel"/>
     <w:tmpl w:val="88A4A392"/>
@@ -14816,14 +14741,285 @@
       </w:pPr>
     </w:lvl>
   </w:abstractNum>
+  <w:abstractNum w:abstractNumId="3" w15:restartNumberingAfterBreak="0">
+    <w:nsid w:val="54823954"/>
+    <w:multiLevelType w:val="multilevel"/>
+    <w:tmpl w:val="14822116"/>
+    <w:lvl w:ilvl="0">
+      <w:start w:val="1"/>
+      <w:numFmt w:val="bullet"/>
+      <w:lvlText w:val=""/>
+      <w:lvlJc w:val="left"/>
+      <w:pPr>
+        <w:tabs>
+          <w:tab w:val="num" w:pos="720"/>
+        </w:tabs>
+        <w:ind w:left="720" w:hanging="360"/>
+      </w:pPr>
+      <w:rPr>
+        <w:rFonts w:ascii="Symbol" w:hAnsi="Symbol" w:hint="default"/>
+        <w:sz w:val="20"/>
+      </w:rPr>
+    </w:lvl>
+    <w:lvl w:ilvl="1" w:tentative="1">
+      <w:start w:val="1"/>
+      <w:numFmt w:val="bullet"/>
+      <w:lvlText w:val="o"/>
+      <w:lvlJc w:val="left"/>
+      <w:pPr>
+        <w:tabs>
+          <w:tab w:val="num" w:pos="1440"/>
+        </w:tabs>
+        <w:ind w:left="1440" w:hanging="360"/>
+      </w:pPr>
+      <w:rPr>
+        <w:rFonts w:ascii="Courier New" w:hAnsi="Courier New" w:hint="default"/>
+        <w:sz w:val="20"/>
+      </w:rPr>
+    </w:lvl>
+    <w:lvl w:ilvl="2" w:tentative="1">
+      <w:start w:val="1"/>
+      <w:numFmt w:val="bullet"/>
+      <w:lvlText w:val=""/>
+      <w:lvlJc w:val="left"/>
+      <w:pPr>
+        <w:tabs>
+          <w:tab w:val="num" w:pos="2160"/>
+        </w:tabs>
+        <w:ind w:left="2160" w:hanging="360"/>
+      </w:pPr>
+      <w:rPr>
+        <w:rFonts w:ascii="Wingdings" w:hAnsi="Wingdings" w:hint="default"/>
+        <w:sz w:val="20"/>
+      </w:rPr>
+    </w:lvl>
+    <w:lvl w:ilvl="3" w:tentative="1">
+      <w:start w:val="1"/>
+      <w:numFmt w:val="bullet"/>
+      <w:lvlText w:val=""/>
+      <w:lvlJc w:val="left"/>
+      <w:pPr>
+        <w:tabs>
+          <w:tab w:val="num" w:pos="2880"/>
+        </w:tabs>
+        <w:ind w:left="2880" w:hanging="360"/>
+      </w:pPr>
+      <w:rPr>
+        <w:rFonts w:ascii="Wingdings" w:hAnsi="Wingdings" w:hint="default"/>
+        <w:sz w:val="20"/>
+      </w:rPr>
+    </w:lvl>
+    <w:lvl w:ilvl="4" w:tentative="1">
+      <w:start w:val="1"/>
+      <w:numFmt w:val="bullet"/>
+      <w:lvlText w:val=""/>
+      <w:lvlJc w:val="left"/>
+      <w:pPr>
+        <w:tabs>
+          <w:tab w:val="num" w:pos="3600"/>
+        </w:tabs>
+        <w:ind w:left="3600" w:hanging="360"/>
+      </w:pPr>
+      <w:rPr>
+        <w:rFonts w:ascii="Wingdings" w:hAnsi="Wingdings" w:hint="default"/>
+        <w:sz w:val="20"/>
+      </w:rPr>
+    </w:lvl>
+    <w:lvl w:ilvl="5" w:tentative="1">
+      <w:start w:val="1"/>
+      <w:numFmt w:val="bullet"/>
+      <w:lvlText w:val=""/>
+      <w:lvlJc w:val="left"/>
+      <w:pPr>
+        <w:tabs>
+          <w:tab w:val="num" w:pos="4320"/>
+        </w:tabs>
+        <w:ind w:left="4320" w:hanging="360"/>
+      </w:pPr>
+      <w:rPr>
+        <w:rFonts w:ascii="Wingdings" w:hAnsi="Wingdings" w:hint="default"/>
+        <w:sz w:val="20"/>
+      </w:rPr>
+    </w:lvl>
+    <w:lvl w:ilvl="6" w:tentative="1">
+      <w:start w:val="1"/>
+      <w:numFmt w:val="bullet"/>
+      <w:lvlText w:val=""/>
+      <w:lvlJc w:val="left"/>
+      <w:pPr>
+        <w:tabs>
+          <w:tab w:val="num" w:pos="5040"/>
+        </w:tabs>
+        <w:ind w:left="5040" w:hanging="360"/>
+      </w:pPr>
+      <w:rPr>
+        <w:rFonts w:ascii="Wingdings" w:hAnsi="Wingdings" w:hint="default"/>
+        <w:sz w:val="20"/>
+      </w:rPr>
+    </w:lvl>
+    <w:lvl w:ilvl="7" w:tentative="1">
+      <w:start w:val="1"/>
+      <w:numFmt w:val="bullet"/>
+      <w:lvlText w:val=""/>
+      <w:lvlJc w:val="left"/>
+      <w:pPr>
+        <w:tabs>
+          <w:tab w:val="num" w:pos="5760"/>
+        </w:tabs>
+        <w:ind w:left="5760" w:hanging="360"/>
+      </w:pPr>
+      <w:rPr>
+        <w:rFonts w:ascii="Wingdings" w:hAnsi="Wingdings" w:hint="default"/>
+        <w:sz w:val="20"/>
+      </w:rPr>
+    </w:lvl>
+    <w:lvl w:ilvl="8" w:tentative="1">
+      <w:start w:val="1"/>
+      <w:numFmt w:val="bullet"/>
+      <w:lvlText w:val=""/>
+      <w:lvlJc w:val="left"/>
+      <w:pPr>
+        <w:tabs>
+          <w:tab w:val="num" w:pos="6480"/>
+        </w:tabs>
+        <w:ind w:left="6480" w:hanging="360"/>
+      </w:pPr>
+      <w:rPr>
+        <w:rFonts w:ascii="Wingdings" w:hAnsi="Wingdings" w:hint="default"/>
+        <w:sz w:val="20"/>
+      </w:rPr>
+    </w:lvl>
+  </w:abstractNum>
+  <w:abstractNum w:abstractNumId="4" w15:restartNumberingAfterBreak="0">
+    <w:nsid w:val="75E230E6"/>
+    <w:multiLevelType w:val="multilevel"/>
+    <w:tmpl w:val="2F820E2C"/>
+    <w:lvl w:ilvl="0">
+      <w:start w:val="1"/>
+      <w:numFmt w:val="decimal"/>
+      <w:lvlText w:val="%1."/>
+      <w:lvlJc w:val="left"/>
+      <w:pPr>
+        <w:tabs>
+          <w:tab w:val="num" w:pos="720"/>
+        </w:tabs>
+        <w:ind w:left="720" w:hanging="360"/>
+      </w:pPr>
+    </w:lvl>
+    <w:lvl w:ilvl="1" w:tentative="1">
+      <w:start w:val="1"/>
+      <w:numFmt w:val="decimal"/>
+      <w:lvlText w:val="%2."/>
+      <w:lvlJc w:val="left"/>
+      <w:pPr>
+        <w:tabs>
+          <w:tab w:val="num" w:pos="1440"/>
+        </w:tabs>
+        <w:ind w:left="1440" w:hanging="360"/>
+      </w:pPr>
+    </w:lvl>
+    <w:lvl w:ilvl="2" w:tentative="1">
+      <w:start w:val="1"/>
+      <w:numFmt w:val="decimal"/>
+      <w:lvlText w:val="%3."/>
+      <w:lvlJc w:val="left"/>
+      <w:pPr>
+        <w:tabs>
+          <w:tab w:val="num" w:pos="2160"/>
+        </w:tabs>
+        <w:ind w:left="2160" w:hanging="360"/>
+      </w:pPr>
+    </w:lvl>
+    <w:lvl w:ilvl="3" w:tentative="1">
+      <w:start w:val="1"/>
+      <w:numFmt w:val="decimal"/>
+      <w:lvlText w:val="%4."/>
+      <w:lvlJc w:val="left"/>
+      <w:pPr>
+        <w:tabs>
+          <w:tab w:val="num" w:pos="2880"/>
+        </w:tabs>
+        <w:ind w:left="2880" w:hanging="360"/>
+      </w:pPr>
+    </w:lvl>
+    <w:lvl w:ilvl="4" w:tentative="1">
+      <w:start w:val="1"/>
+      <w:numFmt w:val="decimal"/>
+      <w:lvlText w:val="%5."/>
+      <w:lvlJc w:val="left"/>
+      <w:pPr>
+        <w:tabs>
+          <w:tab w:val="num" w:pos="3600"/>
+        </w:tabs>
+        <w:ind w:left="3600" w:hanging="360"/>
+      </w:pPr>
+    </w:lvl>
+    <w:lvl w:ilvl="5" w:tentative="1">
+      <w:start w:val="1"/>
+      <w:numFmt w:val="decimal"/>
+      <w:lvlText w:val="%6."/>
+      <w:lvlJc w:val="left"/>
+      <w:pPr>
+        <w:tabs>
+          <w:tab w:val="num" w:pos="4320"/>
+        </w:tabs>
+        <w:ind w:left="4320" w:hanging="360"/>
+      </w:pPr>
+    </w:lvl>
+    <w:lvl w:ilvl="6" w:tentative="1">
+      <w:start w:val="1"/>
+      <w:numFmt w:val="decimal"/>
+      <w:lvlText w:val="%7."/>
+      <w:lvlJc w:val="left"/>
+      <w:pPr>
+        <w:tabs>
+          <w:tab w:val="num" w:pos="5040"/>
+        </w:tabs>
+        <w:ind w:left="5040" w:hanging="360"/>
+      </w:pPr>
+    </w:lvl>
+    <w:lvl w:ilvl="7" w:tentative="1">
+      <w:start w:val="1"/>
+      <w:numFmt w:val="decimal"/>
+      <w:lvlText w:val="%8."/>
+      <w:lvlJc w:val="left"/>
+      <w:pPr>
+        <w:tabs>
+          <w:tab w:val="num" w:pos="5760"/>
+        </w:tabs>
+        <w:ind w:left="5760" w:hanging="360"/>
+      </w:pPr>
+    </w:lvl>
+    <w:lvl w:ilvl="8" w:tentative="1">
+      <w:start w:val="1"/>
+      <w:numFmt w:val="decimal"/>
+      <w:lvlText w:val="%9."/>
+      <w:lvlJc w:val="left"/>
+      <w:pPr>
+        <w:tabs>
+          <w:tab w:val="num" w:pos="6480"/>
+        </w:tabs>
+        <w:ind w:left="6480" w:hanging="360"/>
+      </w:pPr>
+    </w:lvl>
+  </w:abstractNum>
   <w:num w:numId="1">
-    <w:abstractNumId w:val="1"/>
+    <w:abstractNumId w:val="2"/>
     <w:lvlOverride w:ilvl="0">
       <w:startOverride w:val="1"/>
     </w:lvlOverride>
   </w:num>
   <w:num w:numId="2">
+    <w:abstractNumId w:val="1"/>
+  </w:num>
+  <w:num w:numId="3">
+    <w:abstractNumId w:val="4"/>
+  </w:num>
+  <w:num w:numId="4">
     <w:abstractNumId w:val="0"/>
+  </w:num>
+  <w:num w:numId="5">
+    <w:abstractNumId w:val="3"/>
   </w:num>
 </w:numbering>
 </file>
@@ -15426,6 +15622,17 @@
       <w:szCs w:val="24"/>
     </w:rPr>
   </w:style>
+  <w:style w:type="character" w:styleId="a9">
+    <w:name w:val="Strong"/>
+    <w:basedOn w:val="a0"/>
+    <w:uiPriority w:val="22"/>
+    <w:qFormat/>
+    <w:rsid w:val="00B019AF"/>
+    <w:rPr>
+      <w:b/>
+      <w:bCs/>
+    </w:rPr>
+  </w:style>
 </w:styles>
 </file>
 

</xml_diff>